<commit_message>
chore: prepare the repository for a production push
- Ignore QA run artifacts (output/, .playwright-*), the scratch bug-repro copy
  under data/, and local agent tooling. output/ alone was 48MB of screenshots
  and console logs regenerated on every browser check.
- Exclude the scratch copy from tsconfig as well; its imports do not resolve,
  so `npm run typecheck` failed on a clean checkout. Both typecheck and build
  are green now.
- Track AGENTS.md, which documents the repository's working rules.
- Include the pending App.tsx and resume asset changes.

Co-Authored-By: Claude Opus 5 <noreply@anthropic.com>
</commit_message>
<xml_diff>
--- a/public/resume/hashem-kayyali-resume.docx
+++ b/public/resume/hashem-kayyali-resume.docx
@@ -4,783 +4,1458 @@
   <w:body>
     <w:p>
       <w:pPr>
-        <w:keepNext w:val="0"/>
-        <w:spacing w:before="0" w:after="30" w:line="240" w:lineRule="auto"/>
-        <w:jc w:val="center"/>
+        <w:spacing w:before="0" w:after="20" w:line="228" w:lineRule="auto"/>
+        <w:keepNext/>
+        <w:keepLines/>
         <w:widowControl/>
+        <w:pBdr>
+          <w:left w:val="single" w:sz="24" w:space="8" w:color="65172D"/>
+        </w:pBdr>
+        <w:ind w:left="170"/>
       </w:pPr>
       <w:r>
         <w:rPr>
-          <w:rFonts w:ascii="Inter Display" w:hAnsi="Inter Display" w:eastAsia="Inter Display"/>
+          <w:rFonts w:ascii="Arial" w:hAnsi="Arial" w:eastAsia="Arial"/>
           <w:b/>
-          <w:color w:val="4D0D1C"/>
-          <w:sz w:val="46"/>
+          <w:color w:val="330813"/>
+          <w:sz w:val="54"/>
         </w:rPr>
         <w:t>HASHEM KAYYALI</w:t>
       </w:r>
     </w:p>
     <w:p>
       <w:pPr>
-        <w:keepNext w:val="0"/>
-        <w:spacing w:before="0" w:after="26" w:line="240" w:lineRule="auto"/>
-        <w:jc w:val="center"/>
+        <w:keepNext/>
+        <w:keepLines/>
         <w:widowControl/>
+        <w:spacing w:before="0" w:after="100" w:line="240" w:lineRule="auto"/>
+        <w:ind w:left="170"/>
       </w:pPr>
       <w:r>
         <w:rPr>
-          <w:rFonts w:ascii="Inter" w:hAnsi="Inter" w:eastAsia="Inter"/>
+          <w:rFonts w:ascii="Arial" w:hAnsi="Arial" w:eastAsia="Arial"/>
           <w:b/>
-          <w:color w:val="241017"/>
-          <w:sz w:val="19"/>
+          <w:color w:val="8A2944"/>
+          <w:sz w:val="21"/>
         </w:rPr>
-        <w:t>R&amp;D PRODUCT ENGINEER  |  SOFTWARE ENGINEER</w:t>
+        <w:t>CO-FOUNDER &amp; R&amp;D PRODUCT ENGINEER | SOFTWARE ENGINEER</w:t>
       </w:r>
     </w:p>
     <w:p>
       <w:pPr>
-        <w:keepNext w:val="0"/>
-        <w:spacing w:before="0" w:after="60" w:line="240" w:lineRule="auto"/>
-        <w:jc w:val="center"/>
-        <w:pBdr>
-          <w:bottom w:val="single" w:sz="10" w:space="4" w:color="4D0D1C"/>
-        </w:pBdr>
-        <w:widowControl/>
+        <w:pStyle w:val="ResumeContact"/>
+        <w:ind w:left="170"/>
       </w:pPr>
       <w:r>
         <w:rPr>
-          <w:rFonts w:ascii="Inter" w:hAnsi="Inter" w:eastAsia="Inter"/>
-          <w:b w:val="0"/>
-          <w:color w:val="6E5960"/>
-          <w:sz w:val="15"/>
+          <w:rFonts w:ascii="Arial" w:hAnsi="Arial" w:eastAsia="Arial"/>
+          <w:color w:val="5E5659"/>
+          <w:sz w:val="17"/>
         </w:rPr>
-        <w:t>Amman, Jordan  |  +962 78 600 9370  |  hashemkayyali99@gmail.com  |  linkedin.com/in/hashem-kayyali-a4852a2b7</w:t>
+        <w:t>Amman, Jordan</w:t>
       </w:r>
+      <w:r>
+        <w:rPr>
+          <w:rFonts w:ascii="Arial" w:hAnsi="Arial" w:eastAsia="Arial"/>
+          <w:color w:val="DDD6D8"/>
+          <w:sz w:val="17"/>
+        </w:rPr>
+        <w:t xml:space="preserve">  |  </w:t>
+      </w:r>
+      <w:r>
+        <w:rPr>
+          <w:rFonts w:ascii="Arial" w:hAnsi="Arial" w:eastAsia="Arial"/>
+          <w:color w:val="5E5659"/>
+          <w:sz w:val="17"/>
+        </w:rPr>
+        <w:t>+962 78 600 9370</w:t>
+      </w:r>
+      <w:r>
+        <w:rPr>
+          <w:rFonts w:ascii="Arial" w:hAnsi="Arial" w:eastAsia="Arial"/>
+          <w:color w:val="DDD6D8"/>
+          <w:sz w:val="17"/>
+        </w:rPr>
+        <w:t xml:space="preserve">  |  </w:t>
+      </w:r>
+      <w:hyperlink r:id="rId10">
+        <w:r>
+          <w:rPr>
+            <w:rFonts w:ascii="Arial" w:hAnsi="Arial"/>
+            <w:color w:val="65172D"/>
+            <w:sz w:val="18"/>
+            <w:szCs w:val="18"/>
+            <w:u w:val="none"/>
+          </w:rPr>
+          <w:t>hashemkayyali99@gmail.com</w:t>
+        </w:r>
+      </w:hyperlink>
     </w:p>
     <w:p>
       <w:pPr>
+        <w:pStyle w:val="ResumeContact"/>
+        <w:spacing w:after="140"/>
+        <w:ind w:left="170"/>
+        <w:pBdr>
+          <w:bottom w:val="single" w:sz="8" w:space="5" w:color="65172D"/>
+        </w:pBdr>
+      </w:pPr>
+      <w:hyperlink r:id="rId11">
+        <w:r>
+          <w:rPr>
+            <w:rFonts w:ascii="Arial" w:hAnsi="Arial"/>
+            <w:color w:val="65172D"/>
+            <w:sz w:val="18"/>
+            <w:szCs w:val="18"/>
+            <w:u w:val="none"/>
+          </w:rPr>
+          <w:t>linkedin.com/in/hashem-kayyali-a4852a2b7</w:t>
+        </w:r>
+      </w:hyperlink>
+      <w:r>
+        <w:rPr>
+          <w:rFonts w:ascii="Arial" w:hAnsi="Arial" w:eastAsia="Arial"/>
+          <w:color w:val="DDD6D8"/>
+          <w:sz w:val="17"/>
+        </w:rPr>
+        <w:t xml:space="preserve">  |  </w:t>
+      </w:r>
+      <w:hyperlink r:id="rId12">
+        <w:r>
+          <w:rPr>
+            <w:rFonts w:ascii="Arial" w:hAnsi="Arial"/>
+            <w:color w:val="65172D"/>
+            <w:sz w:val="18"/>
+            <w:szCs w:val="18"/>
+            <w:u w:val="none"/>
+          </w:rPr>
+          <w:t>hashemkayyali.com</w:t>
+        </w:r>
+      </w:hyperlink>
+    </w:p>
+    <w:p>
+      <w:pPr>
+        <w:pStyle w:val="Heading1"/>
         <w:keepNext/>
-        <w:spacing w:before="100" w:after="80" w:line="240" w:lineRule="auto"/>
+        <w:keepLines/>
+        <w:widowControl/>
+        <w:spacing w:before="140" w:after="80" w:line="240" w:lineRule="auto"/>
         <w:pBdr>
-          <w:bottom w:val="single" w:sz="7" w:space="2" w:color="D8C9CD"/>
+          <w:bottom w:val="single" w:sz="5" w:space="3" w:color="DDD6D8"/>
         </w:pBdr>
-        <w:widowControl/>
       </w:pPr>
       <w:r>
         <w:rPr>
-          <w:rFonts w:ascii="Inter" w:hAnsi="Inter" w:eastAsia="Inter"/>
+          <w:rFonts w:ascii="Arial" w:hAnsi="Arial" w:eastAsia="Arial"/>
           <w:b/>
-          <w:color w:val="4D0D1C"/>
-          <w:sz w:val="18"/>
+          <w:caps/>
+          <w:color w:val="65172D"/>
+          <w:sz w:val="23"/>
         </w:rPr>
         <w:t>PROFESSIONAL SUMMARY</w:t>
       </w:r>
     </w:p>
     <w:p>
       <w:pPr>
+        <w:pStyle w:val="ResumeSummary"/>
+        <w:shd w:val="clear" w:color="auto" w:fill="F8F5F5"/>
         <w:keepNext w:val="0"/>
-        <w:spacing w:before="0" w:after="30" w:line="259" w:lineRule="auto"/>
+        <w:keepLines/>
+        <w:widowControl/>
+        <w:pBdr>
+          <w:left w:val="single" w:sz="12" w:space="5" w:color="8A2944"/>
+          <w:top w:val="single" w:sz="3" w:space="3" w:color="DDD6D8"/>
+          <w:bottom w:val="single" w:sz="3" w:space="3" w:color="DDD6D8"/>
+        </w:pBdr>
+        <w:ind w:left="130" w:right="130"/>
+      </w:pPr>
+      <w:r>
+        <w:rPr>
+          <w:rFonts w:ascii="Arial" w:hAnsi="Arial" w:eastAsia="Arial"/>
+          <w:color w:val="1D1B1C"/>
+          <w:sz w:val="18"/>
+        </w:rPr>
+        <w:t>Product-minded Co-Founder, R&amp;D Product Engineer, and Software Engineer building end-to-end digital and connected products across web, desktop, mobile, automation, computer vision, and IoT. Owns work from product definition and user experience through architecture, implementation, hardware integration, testing, troubleshooting, and deployment preparation. Combines hands-on engineering with technical operations and customer-facing experience to build software and systems designed for real operating environments.</w:t>
+      </w:r>
+    </w:p>
+    <w:p>
+      <w:pPr>
+        <w:pStyle w:val="Heading1"/>
+        <w:keepNext/>
+        <w:keepLines/>
+        <w:widowControl/>
+        <w:spacing w:before="140" w:after="80" w:line="240" w:lineRule="auto"/>
+        <w:pBdr>
+          <w:bottom w:val="single" w:sz="5" w:space="3" w:color="DDD6D8"/>
+        </w:pBdr>
+      </w:pPr>
+      <w:r>
+        <w:rPr>
+          <w:rFonts w:ascii="Arial" w:hAnsi="Arial" w:eastAsia="Arial"/>
+          <w:b/>
+          <w:caps/>
+          <w:color w:val="65172D"/>
+          <w:sz w:val="23"/>
+        </w:rPr>
+        <w:t>PROFESSIONAL EXPERIENCE</w:t>
+      </w:r>
+    </w:p>
+    <w:p>
+      <w:pPr>
+        <w:pStyle w:val="Heading2"/>
+        <w:tabs>
+          <w:tab w:pos="10318" w:val="right"/>
+        </w:tabs>
+        <w:spacing w:before="110" w:after="20" w:line="240" w:lineRule="auto"/>
+        <w:ind w:left="125"/>
+        <w:keepNext/>
+        <w:keepLines/>
+        <w:widowControl/>
+        <w:pBdr>
+          <w:left w:val="single" w:sz="12" w:space="5" w:color="8A2944"/>
+        </w:pBdr>
+      </w:pPr>
+      <w:r>
+        <w:rPr>
+          <w:rFonts w:ascii="Arial" w:hAnsi="Arial" w:eastAsia="Arial"/>
+          <w:b/>
+          <w:color w:val="330813"/>
+          <w:sz w:val="21"/>
+        </w:rPr>
+        <w:t>Co-Founder &amp; R&amp;D Product Engineer</w:t>
+      </w:r>
+      <w:r>
+        <w:rPr>
+          <w:rFonts w:ascii="Arial" w:hAnsi="Arial" w:eastAsia="Arial"/>
+          <w:b/>
+          <w:color w:val="1D1B1C"/>
+          <w:sz w:val="20"/>
+        </w:rPr>
+        <w:t xml:space="preserve">  |  Eventies</w:t>
+      </w:r>
+      <w:r>
+        <w:rPr>
+          <w:rFonts w:ascii="Arial" w:hAnsi="Arial" w:eastAsia="Arial"/>
+          <w:color w:val="5E5659"/>
+          <w:sz w:val="17"/>
+        </w:rPr>
+        <w:tab/>
+      </w:r>
+      <w:r>
+        <w:rPr>
+          <w:rFonts w:ascii="Arial" w:hAnsi="Arial" w:eastAsia="Arial"/>
+          <w:b/>
+          <w:color w:val="65172D"/>
+          <w:sz w:val="17"/>
+        </w:rPr>
+        <w:t>Aug 2025 - Present</w:t>
+      </w:r>
+    </w:p>
+    <w:p>
+      <w:pPr>
+        <w:pStyle w:val="ResumeMeta"/>
+        <w:keepNext/>
+        <w:keepLines/>
+        <w:widowControl/>
+        <w:ind w:left="125"/>
+      </w:pPr>
+      <w:r>
+        <w:rPr>
+          <w:rFonts w:ascii="Arial" w:hAnsi="Arial" w:eastAsia="Arial"/>
+          <w:color w:val="5E5659"/>
+          <w:sz w:val="17"/>
+        </w:rPr>
+        <w:t>Amman, Jordan</w:t>
+      </w:r>
+    </w:p>
+    <w:p>
+      <w:pPr>
+        <w:pStyle w:val="ListBullet"/>
+        <w:keepNext w:val="0"/>
+        <w:keepLines/>
         <w:widowControl/>
       </w:pPr>
       <w:r>
         <w:rPr>
-          <w:rFonts w:ascii="Inter" w:hAnsi="Inter" w:eastAsia="Inter"/>
-          <w:b w:val="0"/>
-          <w:color w:val="241017"/>
-          <w:sz w:val="17"/>
+          <w:rFonts w:ascii="Arial" w:hAnsi="Arial" w:eastAsia="Arial"/>
+          <w:color w:val="1D1B1C"/>
+          <w:sz w:val="18"/>
         </w:rPr>
-        <w:t>Product-minded Software Engineer and R&amp;D Product Engineer with experience across web, desktop, cross-platform, automation, computer vision, embedded systems, connected products, technical operations, and customer-facing work. Builds products from requirements and interface design through implementation, hardware integration, testing, troubleshooting, and deployment preparation.</w:t>
+        <w:t>Co-founded and lead product and engineering development for Eventies, a bilingual platform for discovering event rentals, activations, production services, and custom builds across Jordan.</w:t>
       </w:r>
     </w:p>
     <w:p>
       <w:pPr>
-        <w:keepNext/>
-        <w:spacing w:before="100" w:after="80" w:line="240" w:lineRule="auto"/>
-        <w:pBdr>
-          <w:bottom w:val="single" w:sz="7" w:space="2" w:color="D8C9CD"/>
-        </w:pBdr>
+        <w:pStyle w:val="ListBullet"/>
+        <w:keepNext w:val="0"/>
+        <w:keepLines/>
         <w:widowControl/>
       </w:pPr>
       <w:r>
         <w:rPr>
-          <w:rFonts w:ascii="Inter" w:hAnsi="Inter" w:eastAsia="Inter"/>
-          <w:b/>
-          <w:color w:val="4D0D1C"/>
+          <w:rFonts w:ascii="Arial" w:hAnsi="Arial" w:eastAsia="Arial"/>
+          <w:color w:val="1D1B1C"/>
           <w:sz w:val="18"/>
         </w:rPr>
-        <w:t>PROFESSIONAL EXPERIENCE</w:t>
+        <w:t>Own product requirements, bilingual UI/UX, full-stack implementation, catalog and service workflows, rental and quotation requests, custom-build inquiries, integrations, security flows, testing, and deployment preparation.</w:t>
       </w:r>
     </w:p>
-    <w:tbl>
-      <w:tblPr>
-        <w:tblW w:type="auto" w:w="0"/>
-        <w:jc w:val="left"/>
-        <w:tblLayout w:type="fixed"/>
-        <w:tblLook w:firstColumn="1" w:firstRow="1" w:lastColumn="0" w:lastRow="0" w:noHBand="0" w:noVBand="1" w:val="04A0"/>
-      </w:tblPr>
-      <w:tblGrid>
-        <w:gridCol w:w="8424"/>
-        <w:gridCol w:w="1656"/>
-      </w:tblGrid>
-      <w:tr>
-        <w:tc>
-          <w:tcPr>
-            <w:tcW w:type="dxa" w:w="5261"/>
-            <w:tcBorders>
-              <w:top w:val="nil"/>
-              <w:left w:val="nil"/>
-              <w:bottom w:val="nil"/>
-              <w:right w:val="nil"/>
-              <w:insideH w:val="nil"/>
-              <w:insideV w:val="nil"/>
-            </w:tcBorders>
-            <w:tcMar>
-              <w:top w:w="0" w:type="dxa"/>
-              <w:start w:w="0" w:type="dxa"/>
-              <w:bottom w:w="0" w:type="dxa"/>
-              <w:end w:w="0" w:type="dxa"/>
-            </w:tcMar>
-            <w:vAlign w:val="top"/>
-          </w:tcPr>
-          <w:p>
-            <w:pPr>
-              <w:keepNext w:val="0"/>
-              <w:spacing w:before="0" w:after="0" w:line="240" w:lineRule="auto"/>
-            </w:pPr>
-            <w:r>
-              <w:rPr>
-                <w:rFonts w:ascii="Inter" w:hAnsi="Inter" w:eastAsia="Inter"/>
-                <w:b/>
-                <w:color w:val="241017"/>
-                <w:sz w:val="19"/>
-              </w:rPr>
-              <w:t>R&amp;D Product Engineer</w:t>
-            </w:r>
-            <w:r>
-              <w:rPr>
-                <w:rFonts w:ascii="Inter" w:hAnsi="Inter" w:eastAsia="Inter"/>
-                <w:b/>
-                <w:color w:val="4D0D1C"/>
-                <w:sz w:val="18"/>
-              </w:rPr>
-              <w:t xml:space="preserve"> | Software &amp; Connected-System Portfolio</w:t>
-            </w:r>
-            <w:r>
-              <w:rPr>
-                <w:rFonts w:ascii="Inter" w:hAnsi="Inter" w:eastAsia="Inter"/>
-                <w:b w:val="0"/>
-                <w:color w:val="6E5960"/>
-                <w:sz w:val="16"/>
-              </w:rPr>
-              <w:t xml:space="preserve"> | Amman, Jordan</w:t>
-            </w:r>
-          </w:p>
-        </w:tc>
-        <w:tc>
-          <w:tcPr>
-            <w:tcW w:type="dxa" w:w="5261"/>
-            <w:tcBorders>
-              <w:top w:val="nil"/>
-              <w:left w:val="nil"/>
-              <w:bottom w:val="nil"/>
-              <w:right w:val="nil"/>
-              <w:insideH w:val="nil"/>
-              <w:insideV w:val="nil"/>
-            </w:tcBorders>
-            <w:tcMar>
-              <w:top w:w="0" w:type="dxa"/>
-              <w:start w:w="0" w:type="dxa"/>
-              <w:bottom w:w="0" w:type="dxa"/>
-              <w:end w:w="0" w:type="dxa"/>
-            </w:tcMar>
-            <w:vAlign w:val="top"/>
-          </w:tcPr>
-          <w:p>
-            <w:pPr>
-              <w:keepNext w:val="0"/>
-              <w:spacing w:before="0" w:after="0" w:line="240" w:lineRule="auto"/>
-              <w:jc w:val="right"/>
-            </w:pPr>
-            <w:r>
-              <w:rPr>
-                <w:rFonts w:ascii="Inter" w:hAnsi="Inter" w:eastAsia="Inter"/>
-                <w:b/>
-                <w:color w:val="4D0D1C"/>
-                <w:sz w:val="16"/>
-              </w:rPr>
-              <w:t>Aug 2026 - Present</w:t>
-            </w:r>
-          </w:p>
-        </w:tc>
-      </w:tr>
-    </w:tbl>
     <w:p>
       <w:pPr>
-        <w:pStyle w:val="CompactBullet"/>
+        <w:pStyle w:val="ListBullet"/>
         <w:keepNext w:val="0"/>
-        <w:spacing w:before="0" w:after="30" w:line="259" w:lineRule="auto"/>
+        <w:keepLines/>
         <w:widowControl/>
       </w:pPr>
       <w:r>
         <w:rPr>
-          <w:rFonts w:ascii="Inter" w:hAnsi="Inter" w:eastAsia="Inter"/>
-          <w:b w:val="0"/>
-          <w:color w:val="241017"/>
-          <w:sz w:val="16"/>
+          <w:rFonts w:ascii="Arial" w:hAnsi="Arial" w:eastAsia="Arial"/>
+          <w:color w:val="1D1B1C"/>
+          <w:sz w:val="18"/>
         </w:rPr>
-        <w:t>Lead end-to-end web, desktop, mobile, automation, computer-vision, and IoT products, owning requirements, UX, APIs, data, firmware, integration, testing, and deployment preparation.</w:t>
+        <w:t>Build and evolve the platform with Next.js, React, TypeScript, Tailwind CSS, Supabase, Cloudinary, and realtime capabilities, translating product and business requirements into structured user journeys, technical plans, features, and working releases.</w:t>
       </w:r>
     </w:p>
     <w:p>
       <w:pPr>
-        <w:pStyle w:val="CompactBullet"/>
+        <w:pStyle w:val="Heading2"/>
+        <w:tabs>
+          <w:tab w:pos="10318" w:val="right"/>
+        </w:tabs>
+        <w:spacing w:before="90" w:after="20" w:line="240" w:lineRule="auto"/>
+        <w:ind w:left="125"/>
+        <w:keepNext/>
+        <w:keepLines/>
+        <w:widowControl/>
+        <w:pBdr>
+          <w:left w:val="single" w:sz="7" w:space="5" w:color="DDD6D8"/>
+        </w:pBdr>
+      </w:pPr>
+      <w:r>
+        <w:rPr>
+          <w:rFonts w:ascii="Arial" w:hAnsi="Arial" w:eastAsia="Arial"/>
+          <w:b/>
+          <w:color w:val="330813"/>
+          <w:sz w:val="21"/>
+        </w:rPr>
+        <w:t>Career Progression</w:t>
+      </w:r>
+      <w:r>
+        <w:rPr>
+          <w:rFonts w:ascii="Arial" w:hAnsi="Arial" w:eastAsia="Arial"/>
+          <w:b/>
+          <w:color w:val="1D1B1C"/>
+          <w:sz w:val="20"/>
+        </w:rPr>
+        <w:t xml:space="preserve">  |  The Terminal VR</w:t>
+      </w:r>
+      <w:r>
+        <w:rPr>
+          <w:rFonts w:ascii="Arial" w:hAnsi="Arial" w:eastAsia="Arial"/>
+          <w:color w:val="5E5659"/>
+          <w:sz w:val="17"/>
+        </w:rPr>
+        <w:tab/>
+      </w:r>
+      <w:r>
+        <w:rPr>
+          <w:rFonts w:ascii="Arial" w:hAnsi="Arial" w:eastAsia="Arial"/>
+          <w:b/>
+          <w:color w:val="65172D"/>
+          <w:sz w:val="17"/>
+        </w:rPr>
+        <w:t>Jan 2025 - Jul 2025</w:t>
+      </w:r>
+    </w:p>
+    <w:p>
+      <w:pPr>
+        <w:pStyle w:val="ResumeMeta"/>
+        <w:keepNext/>
+        <w:keepLines/>
+        <w:widowControl/>
+        <w:ind w:left="125"/>
+      </w:pPr>
+      <w:r>
+        <w:rPr>
+          <w:rFonts w:ascii="Arial" w:hAnsi="Arial" w:eastAsia="Arial"/>
+          <w:color w:val="5E5659"/>
+          <w:sz w:val="17"/>
+        </w:rPr>
+        <w:t>Jordan | Hybrid</w:t>
+      </w:r>
+    </w:p>
+    <w:p>
+      <w:pPr>
+        <w:pStyle w:val="ResumeMeta"/>
+        <w:keepNext/>
+        <w:keepLines/>
+        <w:widowControl/>
+        <w:ind w:left="125"/>
+      </w:pPr>
+      <w:r>
+        <w:rPr>
+          <w:rFonts w:ascii="Arial" w:hAnsi="Arial" w:eastAsia="Arial"/>
+          <w:b/>
+          <w:color w:val="8A2944"/>
+          <w:sz w:val="17"/>
+        </w:rPr>
+        <w:t>PROMOTED AFTER ONE MONTH</w:t>
+      </w:r>
+      <w:r>
+        <w:rPr>
+          <w:rFonts w:ascii="Arial" w:hAnsi="Arial" w:eastAsia="Arial"/>
+          <w:color w:val="5E5659"/>
+          <w:sz w:val="17"/>
+        </w:rPr>
+      </w:r>
+    </w:p>
+    <w:p>
+      <w:pPr>
+        <w:pStyle w:val="ResumeMeta"/>
+        <w:keepNext/>
+        <w:keepLines/>
+        <w:widowControl/>
+        <w:tabs>
+          <w:tab w:pos="10205" w:val="right"/>
+        </w:tabs>
+        <w:spacing w:after="30"/>
+        <w:ind w:left="125"/>
+      </w:pPr>
+      <w:r>
+        <w:rPr>
+          <w:rFonts w:ascii="Arial" w:hAnsi="Arial" w:eastAsia="Arial"/>
+          <w:b/>
+          <w:color w:val="1D1B1C"/>
+          <w:sz w:val="17"/>
+        </w:rPr>
+        <w:t>Sales Representative</w:t>
+      </w:r>
+      <w:r>
+        <w:rPr>
+          <w:rFonts w:ascii="Arial" w:hAnsi="Arial" w:eastAsia="Arial"/>
+          <w:color w:val="5E5659"/>
+          <w:sz w:val="17"/>
+        </w:rPr>
+        <w:tab/>
+      </w:r>
+      <w:r>
+        <w:rPr>
+          <w:rFonts w:ascii="Arial" w:hAnsi="Arial" w:eastAsia="Arial"/>
+          <w:b/>
+          <w:color w:val="65172D"/>
+          <w:sz w:val="17"/>
+        </w:rPr>
+        <w:t>Jan 2025 - Feb 2025</w:t>
+      </w:r>
+    </w:p>
+    <w:p>
+      <w:pPr>
+        <w:pStyle w:val="ResumeMeta"/>
+        <w:keepNext/>
+        <w:keepLines/>
+        <w:widowControl/>
+        <w:tabs>
+          <w:tab w:pos="10205" w:val="right"/>
+        </w:tabs>
+        <w:spacing w:after="30"/>
+        <w:ind w:left="125"/>
+      </w:pPr>
+      <w:r>
+        <w:rPr>
+          <w:rFonts w:ascii="Arial" w:hAnsi="Arial" w:eastAsia="Arial"/>
+          <w:b/>
+          <w:color w:val="1D1B1C"/>
+          <w:sz w:val="17"/>
+        </w:rPr>
+        <w:t>Technical Operations Engineer</w:t>
+      </w:r>
+      <w:r>
+        <w:rPr>
+          <w:rFonts w:ascii="Arial" w:hAnsi="Arial" w:eastAsia="Arial"/>
+          <w:color w:val="5E5659"/>
+          <w:sz w:val="17"/>
+        </w:rPr>
+        <w:tab/>
+      </w:r>
+      <w:r>
+        <w:rPr>
+          <w:rFonts w:ascii="Arial" w:hAnsi="Arial" w:eastAsia="Arial"/>
+          <w:b/>
+          <w:color w:val="65172D"/>
+          <w:sz w:val="17"/>
+        </w:rPr>
+        <w:t>Feb 2025 - Jul 2025</w:t>
+      </w:r>
+    </w:p>
+    <w:p>
+      <w:pPr>
+        <w:pStyle w:val="ListBullet"/>
         <w:keepNext w:val="0"/>
-        <w:spacing w:before="0" w:after="30" w:line="259" w:lineRule="auto"/>
+        <w:keepLines/>
         <w:widowControl/>
       </w:pPr>
       <w:r>
         <w:rPr>
-          <w:rFonts w:ascii="Inter" w:hAnsi="Inter" w:eastAsia="Inter"/>
-          <w:b w:val="0"/>
-          <w:color w:val="241017"/>
-          <w:sz w:val="16"/>
+          <w:rFonts w:ascii="Arial" w:hAnsi="Arial" w:eastAsia="Arial"/>
+          <w:color w:val="1D1B1C"/>
+          <w:sz w:val="18"/>
         </w:rPr>
-        <w:t>Build React, Next.js, Flutter, .NET, Python, and ESP32 solutions using sensors, NFC, BLE, WebSocket, UDP, and real-time communication.</w:t>
+        <w:t>Started in sales, engaging customers, explaining interactive experiences, supporting purchasing decisions, and developing strong product and daily-operations knowledge.</w:t>
       </w:r>
     </w:p>
-    <w:tbl>
-      <w:tblPr>
-        <w:tblW w:type="auto" w:w="0"/>
-        <w:jc w:val="left"/>
-        <w:tblLayout w:type="fixed"/>
-        <w:tblLook w:firstColumn="1" w:firstRow="1" w:lastColumn="0" w:lastRow="0" w:noHBand="0" w:noVBand="1" w:val="04A0"/>
-      </w:tblPr>
-      <w:tblGrid>
-        <w:gridCol w:w="8424"/>
-        <w:gridCol w:w="1656"/>
-      </w:tblGrid>
-      <w:tr>
-        <w:tc>
-          <w:tcPr>
-            <w:tcW w:type="dxa" w:w="5261"/>
-            <w:tcBorders>
-              <w:top w:val="nil"/>
-              <w:left w:val="nil"/>
-              <w:bottom w:val="nil"/>
-              <w:right w:val="nil"/>
-              <w:insideH w:val="nil"/>
-              <w:insideV w:val="nil"/>
-            </w:tcBorders>
-            <w:tcMar>
-              <w:top w:w="0" w:type="dxa"/>
-              <w:start w:w="0" w:type="dxa"/>
-              <w:bottom w:w="0" w:type="dxa"/>
-              <w:end w:w="0" w:type="dxa"/>
-            </w:tcMar>
-            <w:vAlign w:val="top"/>
-          </w:tcPr>
-          <w:p>
-            <w:pPr>
-              <w:keepNext w:val="0"/>
-              <w:spacing w:before="0" w:after="0" w:line="240" w:lineRule="auto"/>
-            </w:pPr>
-            <w:r>
-              <w:rPr>
-                <w:rFonts w:ascii="Inter" w:hAnsi="Inter" w:eastAsia="Inter"/>
-                <w:b/>
-                <w:color w:val="241017"/>
-                <w:sz w:val="19"/>
-              </w:rPr>
-              <w:t>Career Progression</w:t>
-            </w:r>
-            <w:r>
-              <w:rPr>
-                <w:rFonts w:ascii="Inter" w:hAnsi="Inter" w:eastAsia="Inter"/>
-                <w:b/>
-                <w:color w:val="4D0D1C"/>
-                <w:sz w:val="18"/>
-              </w:rPr>
-              <w:t xml:space="preserve"> | The Terminal VR</w:t>
-            </w:r>
-            <w:r>
-              <w:rPr>
-                <w:rFonts w:ascii="Inter" w:hAnsi="Inter" w:eastAsia="Inter"/>
-                <w:b w:val="0"/>
-                <w:color w:val="6E5960"/>
-                <w:sz w:val="16"/>
-              </w:rPr>
-              <w:t xml:space="preserve"> | Jordan | Hybrid</w:t>
-            </w:r>
-          </w:p>
-        </w:tc>
-        <w:tc>
-          <w:tcPr>
-            <w:tcW w:type="dxa" w:w="5261"/>
-            <w:tcBorders>
-              <w:top w:val="nil"/>
-              <w:left w:val="nil"/>
-              <w:bottom w:val="nil"/>
-              <w:right w:val="nil"/>
-              <w:insideH w:val="nil"/>
-              <w:insideV w:val="nil"/>
-            </w:tcBorders>
-            <w:tcMar>
-              <w:top w:w="0" w:type="dxa"/>
-              <w:start w:w="0" w:type="dxa"/>
-              <w:bottom w:w="0" w:type="dxa"/>
-              <w:end w:w="0" w:type="dxa"/>
-            </w:tcMar>
-            <w:vAlign w:val="top"/>
-          </w:tcPr>
-          <w:p>
-            <w:pPr>
-              <w:keepNext w:val="0"/>
-              <w:spacing w:before="0" w:after="0" w:line="240" w:lineRule="auto"/>
-              <w:jc w:val="right"/>
-            </w:pPr>
-            <w:r>
-              <w:rPr>
-                <w:rFonts w:ascii="Inter" w:hAnsi="Inter" w:eastAsia="Inter"/>
-                <w:b/>
-                <w:color w:val="4D0D1C"/>
-                <w:sz w:val="16"/>
-              </w:rPr>
-              <w:t>Jan 2025 - Jul 2025</w:t>
-            </w:r>
-          </w:p>
-        </w:tc>
-      </w:tr>
-    </w:tbl>
     <w:p>
       <w:pPr>
-        <w:pStyle w:val="CompactBullet"/>
+        <w:pStyle w:val="ListBullet"/>
         <w:keepNext w:val="0"/>
-        <w:spacing w:before="0" w:after="30" w:line="259" w:lineRule="auto"/>
+        <w:keepLines/>
         <w:widowControl/>
       </w:pPr>
       <w:r>
         <w:rPr>
-          <w:rFonts w:ascii="Inter" w:hAnsi="Inter" w:eastAsia="Inter"/>
-          <w:b w:val="0"/>
-          <w:color w:val="241017"/>
-          <w:sz w:val="16"/>
+          <w:rFonts w:ascii="Arial" w:hAnsi="Arial" w:eastAsia="Arial"/>
+          <w:color w:val="1D1B1C"/>
+          <w:sz w:val="18"/>
         </w:rPr>
-        <w:t>Started as Sales Representative (Jan 2025 - Feb 2025), engaging customers and developing strong product and operations knowledge; promoted after one month to Technical Operations Engineer (Feb 2025 - Jul 2025).</w:t>
+        <w:t>Promoted after one month to Technical Operations Engineer based on product knowledge, communication, and practical problem solving.</w:t>
       </w:r>
     </w:p>
     <w:p>
       <w:pPr>
-        <w:pStyle w:val="CompactBullet"/>
+        <w:pStyle w:val="ListBullet"/>
         <w:keepNext w:val="0"/>
-        <w:spacing w:before="0" w:after="30" w:line="259" w:lineRule="auto"/>
+        <w:keepLines/>
         <w:widowControl/>
       </w:pPr>
       <w:r>
         <w:rPr>
-          <w:rFonts w:ascii="Inter" w:hAnsi="Inter" w:eastAsia="Inter"/>
-          <w:b w:val="0"/>
-          <w:color w:val="241017"/>
-          <w:sz w:val="16"/>
+          <w:rFonts w:ascii="Arial" w:hAnsi="Arial" w:eastAsia="Arial"/>
+          <w:color w:val="1D1B1C"/>
+          <w:sz w:val="18"/>
         </w:rPr>
-        <w:t>Supported installation, networking, systems integration, hardware diagnostics, maintenance, and software troubleshooting, later managing day-to-day technical operations from a dedicated office.</w:t>
+        <w:t>Supported installation, configuration, networking, system integration, hardware diagnostics, software troubleshooting, maintenance, and operation of interactive technical systems.</w:t>
       </w:r>
     </w:p>
-    <w:tbl>
-      <w:tblPr>
-        <w:tblW w:type="auto" w:w="0"/>
-        <w:jc w:val="left"/>
-        <w:tblLayout w:type="fixed"/>
-        <w:tblLook w:firstColumn="1" w:firstRow="1" w:lastColumn="0" w:lastRow="0" w:noHBand="0" w:noVBand="1" w:val="04A0"/>
-      </w:tblPr>
-      <w:tblGrid>
-        <w:gridCol w:w="8424"/>
-        <w:gridCol w:w="1656"/>
-      </w:tblGrid>
-      <w:tr>
-        <w:tc>
-          <w:tcPr>
-            <w:tcW w:type="dxa" w:w="5261"/>
-            <w:tcBorders>
-              <w:top w:val="nil"/>
-              <w:left w:val="nil"/>
-              <w:bottom w:val="nil"/>
-              <w:right w:val="nil"/>
-              <w:insideH w:val="nil"/>
-              <w:insideV w:val="nil"/>
-            </w:tcBorders>
-            <w:tcMar>
-              <w:top w:w="0" w:type="dxa"/>
-              <w:start w:w="0" w:type="dxa"/>
-              <w:bottom w:w="0" w:type="dxa"/>
-              <w:end w:w="0" w:type="dxa"/>
-            </w:tcMar>
-            <w:vAlign w:val="top"/>
-          </w:tcPr>
-          <w:p>
-            <w:pPr>
-              <w:keepNext w:val="0"/>
-              <w:spacing w:before="0" w:after="0" w:line="240" w:lineRule="auto"/>
-            </w:pPr>
-            <w:r>
-              <w:rPr>
-                <w:rFonts w:ascii="Inter" w:hAnsi="Inter" w:eastAsia="Inter"/>
-                <w:b/>
-                <w:color w:val="241017"/>
-                <w:sz w:val="19"/>
-              </w:rPr>
-              <w:t>Youth Unit Operations Team Member</w:t>
-            </w:r>
-            <w:r>
-              <w:rPr>
-                <w:rFonts w:ascii="Inter" w:hAnsi="Inter" w:eastAsia="Inter"/>
-                <w:b/>
-                <w:color w:val="4D0D1C"/>
-                <w:sz w:val="18"/>
-              </w:rPr>
-              <w:t xml:space="preserve"> | Umniah</w:t>
-            </w:r>
-            <w:r>
-              <w:rPr>
-                <w:rFonts w:ascii="Inter" w:hAnsi="Inter" w:eastAsia="Inter"/>
-                <w:b w:val="0"/>
-                <w:color w:val="6E5960"/>
-                <w:sz w:val="16"/>
-              </w:rPr>
-              <w:t xml:space="preserve"> | Amman, Jordan | Part-time</w:t>
-            </w:r>
-          </w:p>
-        </w:tc>
-        <w:tc>
-          <w:tcPr>
-            <w:tcW w:type="dxa" w:w="5261"/>
-            <w:tcBorders>
-              <w:top w:val="nil"/>
-              <w:left w:val="nil"/>
-              <w:bottom w:val="nil"/>
-              <w:right w:val="nil"/>
-              <w:insideH w:val="nil"/>
-              <w:insideV w:val="nil"/>
-            </w:tcBorders>
-            <w:tcMar>
-              <w:top w:w="0" w:type="dxa"/>
-              <w:start w:w="0" w:type="dxa"/>
-              <w:bottom w:w="0" w:type="dxa"/>
-              <w:end w:w="0" w:type="dxa"/>
-            </w:tcMar>
-            <w:vAlign w:val="top"/>
-          </w:tcPr>
-          <w:p>
-            <w:pPr>
-              <w:keepNext w:val="0"/>
-              <w:spacing w:before="0" w:after="0" w:line="240" w:lineRule="auto"/>
-              <w:jc w:val="right"/>
-            </w:pPr>
-            <w:r>
-              <w:rPr>
-                <w:rFonts w:ascii="Inter" w:hAnsi="Inter" w:eastAsia="Inter"/>
-                <w:b/>
-                <w:color w:val="4D0D1C"/>
-                <w:sz w:val="16"/>
-              </w:rPr>
-              <w:t>Mar 2024 - Jan 2025</w:t>
-            </w:r>
-          </w:p>
-        </w:tc>
-      </w:tr>
-    </w:tbl>
     <w:p>
       <w:pPr>
-        <w:pStyle w:val="CompactBullet"/>
+        <w:pStyle w:val="ListBullet"/>
         <w:keepNext w:val="0"/>
-        <w:spacing w:before="0" w:after="30" w:line="259" w:lineRule="auto"/>
+        <w:keepLines/>
         <w:widowControl/>
       </w:pPr>
       <w:r>
         <w:rPr>
-          <w:rFonts w:ascii="Inter" w:hAnsi="Inter" w:eastAsia="Inter"/>
-          <w:b w:val="0"/>
-          <w:color w:val="241017"/>
-          <w:sz w:val="16"/>
+          <w:rFonts w:ascii="Arial" w:hAnsi="Arial" w:eastAsia="Arial"/>
+          <w:color w:val="1D1B1C"/>
+          <w:sz w:val="18"/>
         </w:rPr>
-        <w:t>Promoted internet and mobile subscriptions, assessed customer needs, recommended suitable services, worked toward sales targets, and handled inquiries and post-sale follow-up.</w:t>
+        <w:t>Later worked from a dedicated office with sole responsibility for day-to-day technical operations, including system setup, support, issue resolution, troubleshooting, and ongoing optimization.</w:t>
       </w:r>
     </w:p>
     <w:p>
       <w:pPr>
+        <w:pStyle w:val="Heading2"/>
+        <w:tabs>
+          <w:tab w:pos="10318" w:val="right"/>
+        </w:tabs>
+        <w:spacing w:before="90" w:after="20" w:line="240" w:lineRule="auto"/>
+        <w:ind w:left="125"/>
         <w:keepNext/>
-        <w:spacing w:before="100" w:after="80" w:line="240" w:lineRule="auto"/>
+        <w:keepLines/>
+        <w:widowControl/>
         <w:pBdr>
-          <w:bottom w:val="single" w:sz="7" w:space="2" w:color="D8C9CD"/>
+          <w:left w:val="single" w:sz="7" w:space="5" w:color="DDD6D8"/>
         </w:pBdr>
+      </w:pPr>
+      <w:r>
+        <w:rPr>
+          <w:rFonts w:ascii="Arial" w:hAnsi="Arial" w:eastAsia="Arial"/>
+          <w:b/>
+          <w:color w:val="330813"/>
+          <w:sz w:val="21"/>
+        </w:rPr>
+        <w:t>Youth Unit Operations Team Member</w:t>
+      </w:r>
+      <w:r>
+        <w:rPr>
+          <w:rFonts w:ascii="Arial" w:hAnsi="Arial" w:eastAsia="Arial"/>
+          <w:b/>
+          <w:color w:val="1D1B1C"/>
+          <w:sz w:val="20"/>
+        </w:rPr>
+        <w:t xml:space="preserve">  |  Umniah</w:t>
+      </w:r>
+      <w:r>
+        <w:rPr>
+          <w:rFonts w:ascii="Arial" w:hAnsi="Arial" w:eastAsia="Arial"/>
+          <w:color w:val="5E5659"/>
+          <w:sz w:val="17"/>
+        </w:rPr>
+        <w:tab/>
+      </w:r>
+      <w:r>
+        <w:rPr>
+          <w:rFonts w:ascii="Arial" w:hAnsi="Arial" w:eastAsia="Arial"/>
+          <w:b/>
+          <w:color w:val="65172D"/>
+          <w:sz w:val="17"/>
+        </w:rPr>
+        <w:t>Mar 2024 - Jan 2025</w:t>
+      </w:r>
+    </w:p>
+    <w:p>
+      <w:pPr>
+        <w:pStyle w:val="ResumeMeta"/>
+        <w:keepNext/>
+        <w:keepLines/>
+        <w:widowControl/>
+        <w:ind w:left="125"/>
+      </w:pPr>
+      <w:r>
+        <w:rPr>
+          <w:rFonts w:ascii="Arial" w:hAnsi="Arial" w:eastAsia="Arial"/>
+          <w:color w:val="5E5659"/>
+          <w:sz w:val="17"/>
+        </w:rPr>
+        <w:t>Amman, Jordan | Part-time</w:t>
+      </w:r>
+    </w:p>
+    <w:p>
+      <w:pPr>
+        <w:pStyle w:val="ListBullet"/>
+        <w:keepNext w:val="0"/>
+        <w:keepLines/>
         <w:widowControl/>
       </w:pPr>
       <w:r>
         <w:rPr>
-          <w:rFonts w:ascii="Inter" w:hAnsi="Inter" w:eastAsia="Inter"/>
+          <w:rFonts w:ascii="Arial" w:hAnsi="Arial" w:eastAsia="Arial"/>
+          <w:color w:val="1D1B1C"/>
+          <w:sz w:val="18"/>
+        </w:rPr>
+        <w:t>Promoted internet and mobile subscriptions through direct customer engagement, identified customer needs, explained available services, and recommended suitable telecommunications solutions.</w:t>
+      </w:r>
+    </w:p>
+    <w:p>
+      <w:pPr>
+        <w:pStyle w:val="ListBullet"/>
+        <w:keepNext w:val="0"/>
+        <w:keepLines/>
+        <w:widowControl/>
+      </w:pPr>
+      <w:r>
+        <w:rPr>
+          <w:rFonts w:ascii="Arial" w:hAnsi="Arial" w:eastAsia="Arial"/>
+          <w:color w:val="1D1B1C"/>
+          <w:sz w:val="18"/>
+        </w:rPr>
+        <w:t>Worked toward individual and team sales targets, handled customer questions and post-sale follow-up, and collaborated with colleagues and marketing teams to support engagement and sales activities.</w:t>
+      </w:r>
+    </w:p>
+    <w:p>
+      <w:pPr>
+        <w:pStyle w:val="Heading1"/>
+        <w:keepNext/>
+        <w:keepLines/>
+        <w:widowControl/>
+        <w:spacing w:before="140" w:after="80" w:line="240" w:lineRule="auto"/>
+        <w:pBdr>
+          <w:bottom w:val="single" w:sz="5" w:space="3" w:color="DDD6D8"/>
+        </w:pBdr>
+      </w:pPr>
+      <w:r>
+        <w:rPr>
+          <w:rFonts w:ascii="Arial" w:hAnsi="Arial" w:eastAsia="Arial"/>
           <w:b/>
-          <w:color w:val="4D0D1C"/>
-          <w:sz w:val="18"/>
+          <w:caps/>
+          <w:color w:val="65172D"/>
+          <w:sz w:val="23"/>
         </w:rPr>
         <w:t>TECHNICAL SKILLS</w:t>
       </w:r>
     </w:p>
     <w:p>
       <w:pPr>
+        <w:pStyle w:val="ResumeSkill"/>
+        <w:shd w:val="clear" w:color="auto" w:fill="F8F5F5"/>
         <w:keepNext w:val="0"/>
-        <w:spacing w:before="0" w:after="14" w:line="250" w:lineRule="auto"/>
+        <w:keepLines/>
         <w:widowControl/>
+        <w:pBdr>
+          <w:left w:val="single" w:sz="5" w:space="4" w:color="DDD6D8"/>
+        </w:pBdr>
+        <w:ind w:left="90" w:right="80"/>
       </w:pPr>
       <w:r>
         <w:rPr>
-          <w:rFonts w:ascii="Inter" w:hAnsi="Inter" w:eastAsia="Inter"/>
+          <w:rFonts w:ascii="Arial" w:hAnsi="Arial" w:eastAsia="Arial"/>
           <w:b/>
-          <w:color w:val="4D0D1C"/>
-          <w:sz w:val="16"/>
+          <w:color w:val="65172D"/>
+          <w:sz w:val="17"/>
         </w:rPr>
-        <w:t xml:space="preserve">Languages: </w:t>
+        <w:t xml:space="preserve">LANGUAGES  </w:t>
       </w:r>
       <w:r>
         <w:rPr>
-          <w:rFonts w:ascii="Inter" w:hAnsi="Inter" w:eastAsia="Inter"/>
-          <w:b w:val="0"/>
-          <w:color w:val="241017"/>
-          <w:sz w:val="16"/>
+          <w:rFonts w:ascii="Arial" w:hAnsi="Arial" w:eastAsia="Arial"/>
+          <w:color w:val="1D1B1C"/>
+          <w:sz w:val="18"/>
         </w:rPr>
         <w:t>TypeScript, JavaScript, Dart, C#, Python, Embedded C++</w:t>
       </w:r>
     </w:p>
     <w:p>
       <w:pPr>
+        <w:pStyle w:val="ResumeSkill"/>
+        <w:shd w:val="clear" w:color="auto" w:fill="F8F5F5"/>
         <w:keepNext w:val="0"/>
-        <w:spacing w:before="0" w:after="14" w:line="250" w:lineRule="auto"/>
+        <w:keepLines/>
         <w:widowControl/>
+        <w:pBdr>
+          <w:left w:val="single" w:sz="5" w:space="4" w:color="DDD6D8"/>
+        </w:pBdr>
+        <w:ind w:left="90" w:right="80"/>
       </w:pPr>
       <w:r>
         <w:rPr>
-          <w:rFonts w:ascii="Inter" w:hAnsi="Inter" w:eastAsia="Inter"/>
+          <w:rFonts w:ascii="Arial" w:hAnsi="Arial" w:eastAsia="Arial"/>
           <w:b/>
-          <w:color w:val="4D0D1C"/>
-          <w:sz w:val="16"/>
+          <w:color w:val="65172D"/>
+          <w:sz w:val="17"/>
         </w:rPr>
-        <w:t xml:space="preserve">Web &amp; Cross-Platform: </w:t>
+        <w:t xml:space="preserve">WEB &amp; FRONTEND  </w:t>
       </w:r>
       <w:r>
         <w:rPr>
-          <w:rFonts w:ascii="Inter" w:hAnsi="Inter" w:eastAsia="Inter"/>
-          <w:b w:val="0"/>
-          <w:color w:val="241017"/>
-          <w:sz w:val="16"/>
+          <w:rFonts w:ascii="Arial" w:hAnsi="Arial" w:eastAsia="Arial"/>
+          <w:color w:val="1D1B1C"/>
+          <w:sz w:val="18"/>
         </w:rPr>
-        <w:t>Next.js, React, Tailwind CSS, Flutter, React Native, WPF, Android Studio</w:t>
+        <w:t>Next.js, React, Tailwind CSS, Responsive UI, Bilingual UI / UX</w:t>
       </w:r>
     </w:p>
     <w:p>
       <w:pPr>
+        <w:pStyle w:val="ResumeSkill"/>
+        <w:shd w:val="clear" w:color="auto" w:fill="F8F5F5"/>
         <w:keepNext w:val="0"/>
-        <w:spacing w:before="0" w:after="14" w:line="250" w:lineRule="auto"/>
+        <w:keepLines/>
         <w:widowControl/>
+        <w:pBdr>
+          <w:left w:val="single" w:sz="5" w:space="4" w:color="DDD6D8"/>
+        </w:pBdr>
+        <w:ind w:left="90" w:right="80"/>
       </w:pPr>
       <w:r>
         <w:rPr>
-          <w:rFonts w:ascii="Inter" w:hAnsi="Inter" w:eastAsia="Inter"/>
+          <w:rFonts w:ascii="Arial" w:hAnsi="Arial" w:eastAsia="Arial"/>
           <w:b/>
-          <w:color w:val="4D0D1C"/>
-          <w:sz w:val="16"/>
+          <w:color w:val="65172D"/>
+          <w:sz w:val="17"/>
         </w:rPr>
-        <w:t xml:space="preserve">Backend &amp; Data: </w:t>
+        <w:t xml:space="preserve">MOBILE &amp; CROSS-PLATFORM  </w:t>
       </w:r>
       <w:r>
         <w:rPr>
-          <w:rFonts w:ascii="Inter" w:hAnsi="Inter" w:eastAsia="Inter"/>
-          <w:b w:val="0"/>
-          <w:color w:val="241017"/>
-          <w:sz w:val="16"/>
+          <w:rFonts w:ascii="Arial" w:hAnsi="Arial" w:eastAsia="Arial"/>
+          <w:color w:val="1D1B1C"/>
+          <w:sz w:val="18"/>
+        </w:rPr>
+        <w:t>Flutter, React Native, Android Studio, Cross-Platform Development</w:t>
+      </w:r>
+    </w:p>
+    <w:p>
+      <w:pPr>
+        <w:pStyle w:val="ResumeSkill"/>
+        <w:shd w:val="clear" w:color="auto" w:fill="F8F5F5"/>
+        <w:keepNext w:val="0"/>
+        <w:keepLines/>
+        <w:widowControl/>
+        <w:pBdr>
+          <w:left w:val="single" w:sz="5" w:space="4" w:color="DDD6D8"/>
+        </w:pBdr>
+        <w:ind w:left="90" w:right="80"/>
+      </w:pPr>
+      <w:r>
+        <w:rPr>
+          <w:rFonts w:ascii="Arial" w:hAnsi="Arial" w:eastAsia="Arial"/>
+          <w:b/>
+          <w:color w:val="65172D"/>
+          <w:sz w:val="17"/>
+        </w:rPr>
+        <w:t xml:space="preserve">BACKEND &amp; DATA  </w:t>
+      </w:r>
+      <w:r>
+        <w:rPr>
+          <w:rFonts w:ascii="Arial" w:hAnsi="Arial" w:eastAsia="Arial"/>
+          <w:color w:val="1D1B1C"/>
+          <w:sz w:val="18"/>
         </w:rPr>
         <w:t>.NET Web API, REST APIs, Supabase, PostgreSQL, SQL, WebSocket</w:t>
       </w:r>
     </w:p>
     <w:p>
       <w:pPr>
+        <w:pStyle w:val="ResumeSkill"/>
+        <w:shd w:val="clear" w:color="auto" w:fill="F8F5F5"/>
         <w:keepNext w:val="0"/>
-        <w:spacing w:before="0" w:after="14" w:line="250" w:lineRule="auto"/>
+        <w:keepLines/>
         <w:widowControl/>
+        <w:pBdr>
+          <w:left w:val="single" w:sz="5" w:space="4" w:color="DDD6D8"/>
+        </w:pBdr>
+        <w:ind w:left="90" w:right="80"/>
       </w:pPr>
       <w:r>
         <w:rPr>
-          <w:rFonts w:ascii="Inter" w:hAnsi="Inter" w:eastAsia="Inter"/>
+          <w:rFonts w:ascii="Arial" w:hAnsi="Arial" w:eastAsia="Arial"/>
           <w:b/>
-          <w:color w:val="4D0D1C"/>
-          <w:sz w:val="16"/>
+          <w:color w:val="65172D"/>
+          <w:sz w:val="17"/>
         </w:rPr>
-        <w:t xml:space="preserve">Embedded &amp; Applied: </w:t>
+        <w:t xml:space="preserve">EMBEDDED / CONNECTED SYSTEMS  </w:t>
       </w:r>
       <w:r>
         <w:rPr>
-          <w:rFonts w:ascii="Inter" w:hAnsi="Inter" w:eastAsia="Inter"/>
-          <w:b w:val="0"/>
-          <w:color w:val="241017"/>
-          <w:sz w:val="16"/>
+          <w:rFonts w:ascii="Arial" w:hAnsi="Arial" w:eastAsia="Arial"/>
+          <w:color w:val="1D1B1C"/>
+          <w:sz w:val="18"/>
         </w:rPr>
-        <w:t>ESP32 / ESP32-S3, BLE, NFC, Hall sensors, MPU6050, WS2812B, Wi-Fi, UDP, Serial, KiCad, OpenCV</w:t>
+        <w:t>ESP32, ESP32-S3, BLE, NFC, Wi-Fi, UDP, Serial Communication, Sensors, Hall Sensors, MPU6050, WS2812B, Real-Time Communication</w:t>
+      </w:r>
+    </w:p>
+    <w:p>
+      <w:pPr>
+        <w:pStyle w:val="ResumeSkill"/>
+        <w:shd w:val="clear" w:color="auto" w:fill="F8F5F5"/>
+        <w:keepNext w:val="0"/>
+        <w:keepLines/>
+        <w:widowControl/>
+        <w:pBdr>
+          <w:left w:val="single" w:sz="5" w:space="4" w:color="DDD6D8"/>
+        </w:pBdr>
+        <w:ind w:left="90" w:right="80"/>
+      </w:pPr>
+      <w:r>
+        <w:rPr>
+          <w:rFonts w:ascii="Arial" w:hAnsi="Arial" w:eastAsia="Arial"/>
+          <w:b/>
+          <w:color w:val="65172D"/>
+          <w:sz w:val="17"/>
+        </w:rPr>
+        <w:t xml:space="preserve">AUTOMATION &amp; APPLIED ENGINEERING  </w:t>
+      </w:r>
+      <w:r>
+        <w:rPr>
+          <w:rFonts w:ascii="Arial" w:hAnsi="Arial" w:eastAsia="Arial"/>
+          <w:color w:val="1D1B1C"/>
+          <w:sz w:val="18"/>
+        </w:rPr>
+        <w:t>Python, OpenCV, Computer Vision, Excel / CSV Processing, Email Automation</w:t>
+      </w:r>
+    </w:p>
+    <w:p>
+      <w:pPr>
+        <w:pStyle w:val="ResumeSkill"/>
+        <w:shd w:val="clear" w:color="auto" w:fill="F8F5F5"/>
+        <w:keepNext w:val="0"/>
+        <w:keepLines/>
+        <w:widowControl/>
+        <w:pBdr>
+          <w:left w:val="single" w:sz="5" w:space="4" w:color="DDD6D8"/>
+        </w:pBdr>
+        <w:ind w:left="90" w:right="80"/>
+      </w:pPr>
+      <w:r>
+        <w:rPr>
+          <w:rFonts w:ascii="Arial" w:hAnsi="Arial" w:eastAsia="Arial"/>
+          <w:b/>
+          <w:color w:val="65172D"/>
+          <w:sz w:val="17"/>
+        </w:rPr>
+        <w:t xml:space="preserve">TOOLS / ENGINEERING  </w:t>
+      </w:r>
+      <w:r>
+        <w:rPr>
+          <w:rFonts w:ascii="Arial" w:hAnsi="Arial" w:eastAsia="Arial"/>
+          <w:color w:val="1D1B1C"/>
+          <w:sz w:val="18"/>
+        </w:rPr>
+        <w:t>Git, Vercel, KiCad</w:t>
+      </w:r>
+    </w:p>
+    <w:p>
+      <w:pPr>
+        <w:spacing w:before="0" w:after="0"/>
+      </w:pPr>
+      <w:r>
+        <w:br w:type="page"/>
+      </w:r>
+    </w:p>
+    <w:p>
+      <w:pPr>
+        <w:pStyle w:val="Heading1"/>
+        <w:keepNext/>
+        <w:keepLines/>
+        <w:widowControl/>
+        <w:spacing w:before="0" w:after="80" w:line="240" w:lineRule="auto"/>
+        <w:pBdr>
+          <w:bottom w:val="single" w:sz="5" w:space="3" w:color="DDD6D8"/>
+        </w:pBdr>
+      </w:pPr>
+      <w:r>
+        <w:rPr>
+          <w:rFonts w:ascii="Arial" w:hAnsi="Arial" w:eastAsia="Arial"/>
+          <w:b/>
+          <w:caps/>
+          <w:color w:val="65172D"/>
+          <w:sz w:val="23"/>
+        </w:rPr>
+        <w:t>SELECTED ENGINEERING PROJECTS</w:t>
+      </w:r>
+    </w:p>
+    <w:p>
+      <w:pPr>
+        <w:pStyle w:val="Heading2"/>
+        <w:keepNext/>
+        <w:keepLines/>
+        <w:widowControl/>
+        <w:spacing w:before="100" w:after="30" w:line="240" w:lineRule="auto"/>
+      </w:pPr>
+      <w:r>
+        <w:rPr>
+          <w:rFonts w:ascii="Arial" w:hAnsi="Arial" w:eastAsia="Arial"/>
+          <w:b/>
+          <w:color w:val="330813"/>
+          <w:sz w:val="20"/>
+        </w:rPr>
+        <w:t>UMNIAH YOUTHCONNECT</w:t>
       </w:r>
     </w:p>
     <w:p>
       <w:pPr>
         <w:keepNext/>
-        <w:spacing w:before="100" w:after="80" w:line="240" w:lineRule="auto"/>
-        <w:pBdr>
-          <w:bottom w:val="single" w:sz="7" w:space="2" w:color="D8C9CD"/>
-        </w:pBdr>
+        <w:keepLines/>
         <w:widowControl/>
+        <w:spacing w:before="0" w:after="40" w:line="254" w:lineRule="auto"/>
       </w:pPr>
       <w:r>
         <w:rPr>
-          <w:rFonts w:ascii="Inter" w:hAnsi="Inter" w:eastAsia="Inter"/>
-          <w:b/>
-          <w:color w:val="4D0D1C"/>
+          <w:rFonts w:ascii="Arial" w:hAnsi="Arial" w:eastAsia="Arial"/>
+          <w:color w:val="1D1B1C"/>
           <w:sz w:val="18"/>
         </w:rPr>
-        <w:t>SELECTED PROJECTS</w:t>
+        <w:t>Internal operations platform for Umniah Youth Unit teams combining member workflows with role-based leader tools for availability, shift leadership, internal support, reporting, operational forms, and Excel exports. Designed and developed authentication and password-reset flows, member workflows, role-based access, the leader dashboard, reporting, and export capabilities.</w:t>
+      </w:r>
+    </w:p>
+    <w:p>
+      <w:pPr>
+        <w:pStyle w:val="ResumeProjectTech"/>
+        <w:shd w:val="clear" w:color="auto" w:fill="F8F5F5"/>
+        <w:keepNext w:val="0"/>
+        <w:keepLines/>
+        <w:widowControl/>
+        <w:pBdr>
+          <w:left w:val="single" w:sz="7" w:space="4" w:color="8A2944"/>
+          <w:bottom w:val="single" w:sz="2" w:space="2" w:color="DDD6D8"/>
+        </w:pBdr>
+        <w:ind w:left="95" w:right="80"/>
+      </w:pPr>
+      <w:r>
+        <w:rPr>
+          <w:rFonts w:ascii="Arial" w:hAnsi="Arial" w:eastAsia="Arial"/>
+          <w:b/>
+          <w:color w:val="65172D"/>
+          <w:sz w:val="17"/>
+        </w:rPr>
+        <w:t xml:space="preserve">TECH  </w:t>
+      </w:r>
+      <w:r>
+        <w:rPr>
+          <w:rFonts w:ascii="Arial" w:hAnsi="Arial" w:eastAsia="Arial"/>
+          <w:color w:val="5E5659"/>
+          <w:sz w:val="17"/>
+        </w:rPr>
+        <w:t>Flutter | Dart | Supabase</w:t>
+      </w:r>
+    </w:p>
+    <w:p>
+      <w:pPr>
+        <w:pStyle w:val="Heading2"/>
+        <w:keepNext/>
+        <w:keepLines/>
+        <w:widowControl/>
+        <w:spacing w:before="100" w:after="30" w:line="240" w:lineRule="auto"/>
+      </w:pPr>
+      <w:r>
+        <w:rPr>
+          <w:rFonts w:ascii="Arial" w:hAnsi="Arial" w:eastAsia="Arial"/>
+          <w:b/>
+          <w:color w:val="330813"/>
+          <w:sz w:val="20"/>
+        </w:rPr>
+        <w:t>BASKET BEATS</w:t>
+      </w:r>
+    </w:p>
+    <w:p>
+      <w:pPr>
+        <w:keepNext/>
+        <w:keepLines/>
+        <w:widowControl/>
+        <w:spacing w:before="0" w:after="40" w:line="254" w:lineRule="auto"/>
+      </w:pPr>
+      <w:r>
+        <w:rPr>
+          <w:rFonts w:ascii="Arial" w:hAnsi="Arial" w:eastAsia="Arial"/>
+          <w:color w:val="1D1B1C"/>
+          <w:sz w:val="18"/>
+        </w:rPr>
+        <w:t>Interactive IoT basketball system combining ESP32 sensor bases, MPU6050 hit detection, LED feedback, real-time scoring, reports, and a Flutter Windows control application. Designed the desktop application, game logic, firmware, impact detection, LED feedback, reports, and local firmware-update workflow.</w:t>
+      </w:r>
+    </w:p>
+    <w:p>
+      <w:pPr>
+        <w:pStyle w:val="ResumeProjectTech"/>
+        <w:shd w:val="clear" w:color="auto" w:fill="F8F5F5"/>
+        <w:keepNext w:val="0"/>
+        <w:keepLines/>
+        <w:widowControl/>
+        <w:pBdr>
+          <w:left w:val="single" w:sz="7" w:space="4" w:color="8A2944"/>
+          <w:bottom w:val="single" w:sz="2" w:space="2" w:color="DDD6D8"/>
+        </w:pBdr>
+        <w:ind w:left="95" w:right="80"/>
+      </w:pPr>
+      <w:r>
+        <w:rPr>
+          <w:rFonts w:ascii="Arial" w:hAnsi="Arial" w:eastAsia="Arial"/>
+          <w:b/>
+          <w:color w:val="65172D"/>
+          <w:sz w:val="17"/>
+        </w:rPr>
+        <w:t xml:space="preserve">TECH  </w:t>
+      </w:r>
+      <w:r>
+        <w:rPr>
+          <w:rFonts w:ascii="Arial" w:hAnsi="Arial" w:eastAsia="Arial"/>
+          <w:color w:val="5E5659"/>
+          <w:sz w:val="17"/>
+        </w:rPr>
+        <w:t>Flutter | Dart | ESP32 | MPU6050 | WebSocket | UDP | SQLite | WS2812B</w:t>
+      </w:r>
+    </w:p>
+    <w:p>
+      <w:pPr>
+        <w:pStyle w:val="Heading2"/>
+        <w:keepNext/>
+        <w:keepLines/>
+        <w:widowControl/>
+        <w:spacing w:before="100" w:after="30" w:line="240" w:lineRule="auto"/>
+      </w:pPr>
+      <w:r>
+        <w:rPr>
+          <w:rFonts w:ascii="Arial" w:hAnsi="Arial" w:eastAsia="Arial"/>
+          <w:b/>
+          <w:color w:val="330813"/>
+          <w:sz w:val="20"/>
+        </w:rPr>
+        <w:t>BIKE TOWER</w:t>
+      </w:r>
+    </w:p>
+    <w:p>
+      <w:pPr>
+        <w:keepNext/>
+        <w:keepLines/>
+        <w:widowControl/>
+        <w:spacing w:before="0" w:after="40" w:line="254" w:lineRule="auto"/>
+      </w:pPr>
+      <w:r>
+        <w:rPr>
+          <w:rFonts w:ascii="Arial" w:hAnsi="Arial" w:eastAsia="Arial"/>
+          <w:color w:val="1D1B1C"/>
+          <w:sz w:val="18"/>
+        </w:rPr>
+        <w:t>Interactive cycling race system connecting physical bicycles, ESP32-S3 towers, Hall sensors, LED strips, and a Flutter desktop controller. Designed race and Tug-of-War logic, local networking, diagnostics, firmware, sensor integration, and LED control.</w:t>
+      </w:r>
+    </w:p>
+    <w:p>
+      <w:pPr>
+        <w:pStyle w:val="ResumeProjectTech"/>
+        <w:shd w:val="clear" w:color="auto" w:fill="F8F5F5"/>
+        <w:keepNext w:val="0"/>
+        <w:keepLines/>
+        <w:widowControl/>
+        <w:pBdr>
+          <w:left w:val="single" w:sz="7" w:space="4" w:color="8A2944"/>
+          <w:bottom w:val="single" w:sz="2" w:space="2" w:color="DDD6D8"/>
+        </w:pBdr>
+        <w:ind w:left="95" w:right="80"/>
+      </w:pPr>
+      <w:r>
+        <w:rPr>
+          <w:rFonts w:ascii="Arial" w:hAnsi="Arial" w:eastAsia="Arial"/>
+          <w:b/>
+          <w:color w:val="65172D"/>
+          <w:sz w:val="17"/>
+        </w:rPr>
+        <w:t xml:space="preserve">TECH  </w:t>
+      </w:r>
+      <w:r>
+        <w:rPr>
+          <w:rFonts w:ascii="Arial" w:hAnsi="Arial" w:eastAsia="Arial"/>
+          <w:color w:val="5E5659"/>
+          <w:sz w:val="17"/>
+        </w:rPr>
+        <w:t>Flutter | ESP32-S3 | Hall Sensors | WebSocket | UDP | FastLED / WS2812B</w:t>
+      </w:r>
+    </w:p>
+    <w:p>
+      <w:pPr>
+        <w:pStyle w:val="Heading2"/>
+        <w:keepNext/>
+        <w:keepLines/>
+        <w:widowControl/>
+        <w:spacing w:before="100" w:after="30" w:line="240" w:lineRule="auto"/>
+      </w:pPr>
+      <w:r>
+        <w:rPr>
+          <w:rFonts w:ascii="Arial" w:hAnsi="Arial" w:eastAsia="Arial"/>
+          <w:b/>
+          <w:color w:val="330813"/>
+          <w:sz w:val="20"/>
+        </w:rPr>
+        <w:t>THE TERMINAL NFC</w:t>
+      </w:r>
+    </w:p>
+    <w:p>
+      <w:pPr>
+        <w:keepNext/>
+        <w:keepLines/>
+        <w:widowControl/>
+        <w:spacing w:before="0" w:after="40" w:line="254" w:lineRule="auto"/>
+      </w:pPr>
+      <w:r>
+        <w:rPr>
+          <w:rFonts w:ascii="Arial" w:hAnsi="Arial" w:eastAsia="Arial"/>
+          <w:color w:val="1D1B1C"/>
+          <w:sz w:val="18"/>
+        </w:rPr>
+        <w:t>NFC-enabled client-server point-of-sale system connecting staff POS workflows, NFC customer identification, account verification, client applications, API communication, and centralized transaction records. Designed the POS workflow, WPF applications, client-server architecture, API, NFC integration, and transaction flow.</w:t>
+      </w:r>
+    </w:p>
+    <w:p>
+      <w:pPr>
+        <w:pStyle w:val="ResumeProjectTech"/>
+        <w:shd w:val="clear" w:color="auto" w:fill="F8F5F5"/>
+        <w:keepNext w:val="0"/>
+        <w:keepLines/>
+        <w:widowControl/>
+        <w:pBdr>
+          <w:left w:val="single" w:sz="7" w:space="4" w:color="8A2944"/>
+          <w:bottom w:val="single" w:sz="2" w:space="2" w:color="DDD6D8"/>
+        </w:pBdr>
+        <w:ind w:left="95" w:right="80"/>
+      </w:pPr>
+      <w:r>
+        <w:rPr>
+          <w:rFonts w:ascii="Arial" w:hAnsi="Arial" w:eastAsia="Arial"/>
+          <w:b/>
+          <w:color w:val="65172D"/>
+          <w:sz w:val="17"/>
+        </w:rPr>
+        <w:t xml:space="preserve">TECH  </w:t>
+      </w:r>
+      <w:r>
+        <w:rPr>
+          <w:rFonts w:ascii="Arial" w:hAnsi="Arial" w:eastAsia="Arial"/>
+          <w:color w:val="5E5659"/>
+          <w:sz w:val="17"/>
+        </w:rPr>
+        <w:t>C# | WPF | .NET Web API | NFC | REST APIs</w:t>
+      </w:r>
+    </w:p>
+    <w:p>
+      <w:pPr>
+        <w:pStyle w:val="Heading2"/>
+        <w:keepNext/>
+        <w:keepLines/>
+        <w:widowControl/>
+        <w:spacing w:before="100" w:after="30" w:line="240" w:lineRule="auto"/>
+      </w:pPr>
+      <w:r>
+        <w:rPr>
+          <w:rFonts w:ascii="Arial" w:hAnsi="Arial" w:eastAsia="Arial"/>
+          <w:b/>
+          <w:color w:val="330813"/>
+          <w:sz w:val="20"/>
+        </w:rPr>
+        <w:t>GLITZZ LAB</w:t>
+      </w:r>
+    </w:p>
+    <w:p>
+      <w:pPr>
+        <w:keepNext/>
+        <w:keepLines/>
+        <w:widowControl/>
+        <w:spacing w:before="0" w:after="40" w:line="254" w:lineRule="auto"/>
+      </w:pPr>
+      <w:r>
+        <w:rPr>
+          <w:rFonts w:ascii="Arial" w:hAnsi="Arial" w:eastAsia="Arial"/>
+          <w:color w:val="1D1B1C"/>
+          <w:sz w:val="18"/>
+        </w:rPr>
+        <w:t>Bilingual event-service booking and operations platform with service configuration, availability checks, pricing, booking requests, customer workflows, payment handling, and an owner dashboard. Designed the product, bilingual UI/UX, booking workflows, database integration, automation, testing, and deployment.</w:t>
+      </w:r>
+    </w:p>
+    <w:p>
+      <w:pPr>
+        <w:pStyle w:val="ResumeProjectTech"/>
+        <w:shd w:val="clear" w:color="auto" w:fill="F8F5F5"/>
+        <w:keepNext w:val="0"/>
+        <w:keepLines/>
+        <w:widowControl/>
+        <w:pBdr>
+          <w:left w:val="single" w:sz="7" w:space="4" w:color="8A2944"/>
+          <w:bottom w:val="single" w:sz="2" w:space="2" w:color="DDD6D8"/>
+        </w:pBdr>
+        <w:ind w:left="95" w:right="80"/>
+      </w:pPr>
+      <w:r>
+        <w:rPr>
+          <w:rFonts w:ascii="Arial" w:hAnsi="Arial" w:eastAsia="Arial"/>
+          <w:b/>
+          <w:color w:val="65172D"/>
+          <w:sz w:val="17"/>
+        </w:rPr>
+        <w:t xml:space="preserve">TECH  </w:t>
+      </w:r>
+      <w:r>
+        <w:rPr>
+          <w:rFonts w:ascii="Arial" w:hAnsi="Arial" w:eastAsia="Arial"/>
+          <w:color w:val="5E5659"/>
+          <w:sz w:val="17"/>
+        </w:rPr>
+        <w:t>Next.js | TypeScript | Supabase | PostgreSQL | WhatsApp API</w:t>
+      </w:r>
+    </w:p>
+    <w:p>
+      <w:pPr>
+        <w:pStyle w:val="Heading2"/>
+        <w:keepNext/>
+        <w:keepLines/>
+        <w:widowControl/>
+        <w:spacing w:before="100" w:after="30" w:line="240" w:lineRule="auto"/>
+      </w:pPr>
+      <w:r>
+        <w:rPr>
+          <w:rFonts w:ascii="Arial" w:hAnsi="Arial" w:eastAsia="Arial"/>
+          <w:b/>
+          <w:color w:val="330813"/>
+          <w:sz w:val="20"/>
+        </w:rPr>
+        <w:t>TRAFFIC FLOW ANALYTICS STUDIO</w:t>
+      </w:r>
+    </w:p>
+    <w:p>
+      <w:pPr>
+        <w:keepNext/>
+        <w:keepLines/>
+        <w:widowControl/>
+        <w:spacing w:before="0" w:after="40" w:line="254" w:lineRule="auto"/>
+      </w:pPr>
+      <w:r>
+        <w:rPr>
+          <w:rFonts w:ascii="Arial" w:hAnsi="Arial" w:eastAsia="Arial"/>
+          <w:color w:val="1D1B1C"/>
+          <w:sz w:val="18"/>
+        </w:rPr>
+        <w:t>Desktop computer-vision system for detecting, tracking, counting, and analyzing vehicle movement in recorded road footage with structured reporting and annotated-video exports. Designed the interface, video-analysis tools, tracking pipeline, background processing, project storage, and CSV / Excel exports.</w:t>
+      </w:r>
+    </w:p>
+    <w:p>
+      <w:pPr>
+        <w:pStyle w:val="ResumeProjectTech"/>
+        <w:shd w:val="clear" w:color="auto" w:fill="F8F5F5"/>
+        <w:keepNext w:val="0"/>
+        <w:keepLines/>
+        <w:widowControl/>
+        <w:pBdr>
+          <w:left w:val="single" w:sz="7" w:space="4" w:color="8A2944"/>
+          <w:bottom w:val="single" w:sz="2" w:space="2" w:color="DDD6D8"/>
+        </w:pBdr>
+        <w:ind w:left="95" w:right="80"/>
+      </w:pPr>
+      <w:r>
+        <w:rPr>
+          <w:rFonts w:ascii="Arial" w:hAnsi="Arial" w:eastAsia="Arial"/>
+          <w:b/>
+          <w:color w:val="65172D"/>
+          <w:sz w:val="17"/>
+        </w:rPr>
+        <w:t xml:space="preserve">TECH  </w:t>
+      </w:r>
+      <w:r>
+        <w:rPr>
+          <w:rFonts w:ascii="Arial" w:hAnsi="Arial" w:eastAsia="Arial"/>
+          <w:color w:val="5E5659"/>
+          <w:sz w:val="17"/>
+        </w:rPr>
+        <w:t>Python | PySide6 | OpenCV | YOLOv8 | BoT-SORT</w:t>
       </w:r>
     </w:p>
     <w:p>
       <w:pPr>
         <w:keepNext w:val="0"/>
-        <w:spacing w:before="0" w:after="36" w:line="257" w:lineRule="auto"/>
+        <w:keepLines/>
         <w:widowControl/>
+        <w:spacing w:before="0" w:after="80" w:line="240" w:lineRule="auto"/>
       </w:pPr>
       <w:r>
         <w:rPr>
-          <w:rFonts w:ascii="Inter" w:hAnsi="Inter" w:eastAsia="Inter"/>
+          <w:rFonts w:ascii="Arial" w:hAnsi="Arial" w:eastAsia="Arial"/>
           <w:b/>
-          <w:color w:val="4D0D1C"/>
-          <w:sz w:val="16"/>
+          <w:color w:val="65172D"/>
+          <w:sz w:val="17"/>
         </w:rPr>
-        <w:t xml:space="preserve">Eventies &amp; Glitzz Lab: </w:t>
+        <w:t xml:space="preserve">Additional R&amp;D work: </w:t>
       </w:r>
       <w:r>
         <w:rPr>
-          <w:rFonts w:ascii="Inter" w:hAnsi="Inter" w:eastAsia="Inter"/>
-          <w:b w:val="0"/>
-          <w:color w:val="241017"/>
-          <w:sz w:val="16"/>
+          <w:rFonts w:ascii="Arial" w:hAnsi="Arial" w:eastAsia="Arial"/>
+          <w:color w:val="5E5659"/>
+          <w:sz w:val="17"/>
         </w:rPr>
-        <w:t>Bilingual web platforms for event-service discovery, bookings, requests, customer workflows, and owner operations.</w:t>
+        <w:t>VR Cycling | Bike-Land Smart Cycling Trainer | Outreach Automation Platform</w:t>
+      </w:r>
+    </w:p>
+    <w:p>
+      <w:pPr>
+        <w:pStyle w:val="Heading1"/>
+        <w:keepNext/>
+        <w:keepLines/>
+        <w:widowControl/>
+        <w:spacing w:before="140" w:after="80" w:line="240" w:lineRule="auto"/>
+        <w:pBdr>
+          <w:bottom w:val="single" w:sz="5" w:space="3" w:color="DDD6D8"/>
+        </w:pBdr>
+      </w:pPr>
+      <w:r>
+        <w:rPr>
+          <w:rFonts w:ascii="Arial" w:hAnsi="Arial" w:eastAsia="Arial"/>
+          <w:b/>
+          <w:caps/>
+          <w:color w:val="65172D"/>
+          <w:sz w:val="23"/>
+        </w:rPr>
+        <w:t>EDUCATION</w:t>
+      </w:r>
+    </w:p>
+    <w:p>
+      <w:pPr>
+        <w:keepNext/>
+        <w:keepLines/>
+        <w:widowControl/>
+        <w:spacing w:before="0" w:after="20" w:line="240" w:lineRule="auto"/>
+      </w:pPr>
+      <w:r>
+        <w:rPr>
+          <w:rFonts w:ascii="Arial" w:hAnsi="Arial" w:eastAsia="Arial"/>
+          <w:b/>
+          <w:color w:val="330813"/>
+          <w:sz w:val="20"/>
+        </w:rPr>
+        <w:t>Bachelor-level studies in Software Engineering</w:t>
+      </w:r>
+    </w:p>
+    <w:p>
+      <w:pPr>
+        <w:pStyle w:val="ResumeMeta"/>
+        <w:spacing w:after="80"/>
+      </w:pPr>
+      <w:r>
+        <w:rPr>
+          <w:rFonts w:ascii="Arial" w:hAnsi="Arial" w:eastAsia="Arial"/>
+          <w:i/>
+          <w:color w:val="5E5659"/>
+          <w:sz w:val="17"/>
+        </w:rPr>
+        <w:t>In Progress</w:t>
+      </w:r>
+    </w:p>
+    <w:p>
+      <w:pPr>
+        <w:pStyle w:val="Heading1"/>
+        <w:keepNext/>
+        <w:keepLines/>
+        <w:widowControl/>
+        <w:spacing w:before="140" w:after="80" w:line="240" w:lineRule="auto"/>
+        <w:pBdr>
+          <w:bottom w:val="single" w:sz="5" w:space="3" w:color="DDD6D8"/>
+        </w:pBdr>
+      </w:pPr>
+      <w:r>
+        <w:rPr>
+          <w:rFonts w:ascii="Arial" w:hAnsi="Arial" w:eastAsia="Arial"/>
+          <w:b/>
+          <w:caps/>
+          <w:color w:val="65172D"/>
+          <w:sz w:val="23"/>
+        </w:rPr>
+        <w:t>CORE ENGINEERING STRENGTHS</w:t>
+      </w:r>
+    </w:p>
+    <w:p>
+      <w:pPr>
+        <w:pStyle w:val="ResumeSummary"/>
+        <w:shd w:val="clear" w:color="auto" w:fill="F8F5F5"/>
+        <w:keepNext w:val="0"/>
+        <w:keepLines/>
+        <w:widowControl/>
+        <w:pBdr>
+          <w:left w:val="single" w:sz="10" w:space="4" w:color="8A2944"/>
+          <w:top w:val="single" w:sz="2" w:space="2" w:color="DDD6D8"/>
+          <w:bottom w:val="single" w:sz="2" w:space="2" w:color="DDD6D8"/>
+        </w:pBdr>
+        <w:ind w:left="110" w:right="100"/>
+      </w:pPr>
+      <w:r>
+        <w:rPr>
+          <w:rFonts w:ascii="Arial" w:hAnsi="Arial" w:eastAsia="Arial"/>
+          <w:color w:val="1D1B1C"/>
+          <w:sz w:val="18"/>
+        </w:rPr>
+        <w:t>End-to-End Product Engineering | Full-Stack Software Development | Cross-Platform Application Development | API &amp; Database Integration | Hardware-Software Integration | Embedded / Connected Systems | Technical Troubleshooting | Product Requirements &amp; User Flows | Testing &amp; Deployment Preparation | Customer &amp; Operational Context</w:t>
       </w:r>
     </w:p>
     <w:p>
       <w:pPr>
         <w:keepNext w:val="0"/>
-        <w:spacing w:before="0" w:after="36" w:line="257" w:lineRule="auto"/>
+        <w:keepLines/>
         <w:widowControl/>
+        <w:spacing w:before="20" w:after="0" w:line="240" w:lineRule="auto"/>
       </w:pPr>
       <w:r>
         <w:rPr>
-          <w:rFonts w:ascii="Inter" w:hAnsi="Inter" w:eastAsia="Inter"/>
+          <w:rFonts w:ascii="Arial" w:hAnsi="Arial" w:eastAsia="Arial"/>
           <w:b/>
-          <w:color w:val="4D0D1C"/>
-          <w:sz w:val="16"/>
+          <w:color w:val="65172D"/>
+          <w:sz w:val="17"/>
         </w:rPr>
-        <w:t xml:space="preserve">Umniah YouthConnect: </w:t>
+        <w:t xml:space="preserve">PROFESSIONAL FOCUS  </w:t>
       </w:r>
       <w:r>
         <w:rPr>
-          <w:rFonts w:ascii="Inter" w:hAnsi="Inter" w:eastAsia="Inter"/>
-          <w:b w:val="0"/>
-          <w:color w:val="241017"/>
-          <w:sz w:val="16"/>
+          <w:rFonts w:ascii="Arial" w:hAnsi="Arial" w:eastAsia="Arial"/>
+          <w:color w:val="5E5659"/>
+          <w:sz w:val="17"/>
         </w:rPr>
-        <w:t>Flutter and Supabase internal operations platform with member workflows, role-based leader dashboard, reporting, and Excel export.</w:t>
-      </w:r>
-    </w:p>
-    <w:p>
-      <w:pPr>
-        <w:keepNext w:val="0"/>
-        <w:spacing w:before="0" w:after="36" w:line="257" w:lineRule="auto"/>
-        <w:widowControl/>
-      </w:pPr>
-      <w:r>
-        <w:rPr>
-          <w:rFonts w:ascii="Inter" w:hAnsi="Inter" w:eastAsia="Inter"/>
-          <w:b/>
-          <w:color w:val="4D0D1C"/>
-          <w:sz w:val="16"/>
-        </w:rPr>
-        <w:t xml:space="preserve">Basket Beats: </w:t>
-      </w:r>
-      <w:r>
-        <w:rPr>
-          <w:rFonts w:ascii="Inter" w:hAnsi="Inter" w:eastAsia="Inter"/>
-          <w:b w:val="0"/>
-          <w:color w:val="241017"/>
-          <w:sz w:val="16"/>
-        </w:rPr>
-        <w:t>Interactive IoT basketball system with ESP32 sensor bases, real-time scoring, LED feedback, reports, and Flutter Windows control.</w:t>
-      </w:r>
-    </w:p>
-    <w:p>
-      <w:pPr>
-        <w:keepNext w:val="0"/>
-        <w:spacing w:before="0" w:after="36" w:line="257" w:lineRule="auto"/>
-        <w:widowControl/>
-      </w:pPr>
-      <w:r>
-        <w:rPr>
-          <w:rFonts w:ascii="Inter" w:hAnsi="Inter" w:eastAsia="Inter"/>
-          <w:b/>
-          <w:color w:val="4D0D1C"/>
-          <w:sz w:val="16"/>
-        </w:rPr>
-        <w:t xml:space="preserve">The Terminal NFC: </w:t>
-      </w:r>
-      <w:r>
-        <w:rPr>
-          <w:rFonts w:ascii="Inter" w:hAnsi="Inter" w:eastAsia="Inter"/>
-          <w:b w:val="0"/>
-          <w:color w:val="241017"/>
-          <w:sz w:val="16"/>
-        </w:rPr>
-        <w:t>Client-server NFC point-of-sale system with WPF applications, account verification, centralized transactions, and a .NET API.</w:t>
-      </w:r>
-    </w:p>
-    <w:p>
-      <w:pPr>
-        <w:keepNext/>
-        <w:spacing w:before="100" w:after="80" w:line="240" w:lineRule="auto"/>
-        <w:pBdr>
-          <w:bottom w:val="single" w:sz="7" w:space="2" w:color="D8C9CD"/>
-        </w:pBdr>
-        <w:widowControl/>
-      </w:pPr>
-      <w:r>
-        <w:rPr>
-          <w:rFonts w:ascii="Inter" w:hAnsi="Inter" w:eastAsia="Inter"/>
-          <w:b/>
-          <w:color w:val="4D0D1C"/>
-          <w:sz w:val="18"/>
-        </w:rPr>
-        <w:t>EDUCATION &amp; PROFESSIONAL FOCUS</w:t>
-      </w:r>
-    </w:p>
-    <w:p>
-      <w:pPr>
-        <w:keepNext w:val="0"/>
-        <w:spacing w:before="0" w:after="0" w:line="252" w:lineRule="auto"/>
-        <w:widowControl/>
-      </w:pPr>
-      <w:r>
-        <w:rPr>
-          <w:rFonts w:ascii="Inter" w:hAnsi="Inter" w:eastAsia="Inter"/>
-          <w:b w:val="0"/>
-          <w:color w:val="241017"/>
-          <w:sz w:val="16"/>
-        </w:rPr>
-        <w:t>Bachelor-level studies in Software Engineering (in progress). Target roles: Software Engineer, R&amp;D Product Engineer, Full-Stack Developer, Mobile Developer, and IoT Developer.</w:t>
+        <w:t>R&amp;D Product Engineering | Software Engineering | Full-Stack Development | Cross-Platform Software | IoT / Connected Systems | Automation | Applied Computer Vision</w:t>
       </w:r>
     </w:p>
     <w:sectPr>
       <w:footerReference w:type="default" r:id="rId9"/>
-      <w:pgSz w:w="11905" w:h="16838"/>
-      <w:pgMar w:top="547" w:right="691" w:bottom="504" w:left="691" w:header="216" w:footer="216" w:gutter="0"/>
+      <w:pgSz w:w="11906" w:h="16838"/>
+      <w:pgMar w:top="680" w:right="737" w:bottom="680" w:left="737" w:header="283" w:footer="283" w:gutter="0"/>
       <w:cols w:space="720"/>
       <w:docGrid w:linePitch="360"/>
     </w:sectPr>
@@ -790,20 +1465,98 @@
 
 <file path=word/footer1.xml><?xml version="1.0" encoding="utf-8"?>
 <w:ftr xmlns:m="http://schemas.openxmlformats.org/officeDocument/2006/math" xmlns:mc="http://schemas.openxmlformats.org/markup-compatibility/2006" xmlns:mo="http://schemas.microsoft.com/office/mac/office/2008/main" xmlns:mv="urn:schemas-microsoft-com:mac:vml" xmlns:o="urn:schemas-microsoft-com:office:office" xmlns:r="http://schemas.openxmlformats.org/officeDocument/2006/relationships" xmlns:v="urn:schemas-microsoft-com:vml" xmlns:w10="urn:schemas-microsoft-com:office:word" xmlns:w14="http://schemas.microsoft.com/office/word/2010/wordml" xmlns:w="http://schemas.openxmlformats.org/wordprocessingml/2006/main" xmlns:wne="http://schemas.microsoft.com/office/word/2006/wordml" xmlns:wp14="http://schemas.microsoft.com/office/word/2010/wordprocessingDrawing" xmlns:wp="http://schemas.openxmlformats.org/drawingml/2006/wordprocessingDrawing" xmlns:wpc="http://schemas.microsoft.com/office/word/2010/wordprocessingCanvas" xmlns:wpg="http://schemas.microsoft.com/office/word/2010/wordprocessingGroup" xmlns:wpi="http://schemas.microsoft.com/office/word/2010/wordprocessingInk" xmlns:wps="http://schemas.microsoft.com/office/word/2010/wordprocessingShape" mc:Ignorable="w14 wp14">
+  <w:tbl>
+    <w:tblPr>
+      <w:tblW w:type="dxa" w:w="10431"/>
+      <w:tblLayout w:type="fixed"/>
+      <w:tblLook w:firstColumn="1" w:firstRow="1" w:lastColumn="0" w:lastRow="0" w:noHBand="0" w:noVBand="1" w:val="04A0"/>
+      <w:tblLayout w:type="fixed"/>
+      <w:tblInd w:w="0" w:type="dxa"/>
+    </w:tblPr>
+    <w:tblGrid>
+      <w:gridCol w:w="7597"/>
+      <w:gridCol w:w="2835"/>
+    </w:tblGrid>
+    <w:tr>
+      <w:tc>
+        <w:tcPr>
+          <w:tcW w:type="dxa" w:w="7597"/>
+          <w:vAlign w:val="center"/>
+          <w:tcBorders>
+            <w:top w:val="single" w:sz="5" w:space="0" w:color="DDD6D8"/>
+          </w:tcBorders>
+          <w:tcMar>
+            <w:top w:w="40" w:type="dxa"/>
+            <w:bottom w:w="0" w:type="dxa"/>
+            <w:start w:w="0" w:type="dxa"/>
+            <w:end w:w="0" w:type="dxa"/>
+          </w:tcMar>
+        </w:tcPr>
+        <w:p>
+          <w:pPr>
+            <w:pStyle w:val="ResumeFooter"/>
+            <w:jc w:val="left"/>
+          </w:pPr>
+          <w:r>
+            <w:rPr>
+              <w:rFonts w:ascii="Arial" w:hAnsi="Arial" w:eastAsia="Arial"/>
+              <w:b/>
+              <w:color w:val="5E5659"/>
+              <w:sz w:val="15"/>
+            </w:rPr>
+            <w:t>HASHEM KAYYALI  |  PRODUCT &amp; SOFTWARE ENGINEERING</w:t>
+          </w:r>
+        </w:p>
+      </w:tc>
+      <w:tc>
+        <w:tcPr>
+          <w:tcW w:type="dxa" w:w="2835"/>
+          <w:vAlign w:val="center"/>
+          <w:tcBorders>
+            <w:top w:val="single" w:sz="5" w:space="0" w:color="DDD6D8"/>
+          </w:tcBorders>
+          <w:tcMar>
+            <w:top w:w="40" w:type="dxa"/>
+            <w:bottom w:w="0" w:type="dxa"/>
+            <w:start w:w="0" w:type="dxa"/>
+            <w:end w:w="0" w:type="dxa"/>
+          </w:tcMar>
+        </w:tcPr>
+        <w:p>
+          <w:pPr>
+            <w:pStyle w:val="ResumeFooter"/>
+            <w:jc w:val="right"/>
+          </w:pPr>
+          <w:r>
+            <w:rPr>
+              <w:rFonts w:ascii="Arial" w:hAnsi="Arial" w:eastAsia="Arial"/>
+              <w:b/>
+              <w:color w:val="5E5659"/>
+              <w:sz w:val="15"/>
+            </w:rPr>
+            <w:t xml:space="preserve">PAGE </w:t>
+          </w:r>
+          <w:r>
+            <w:rPr>
+              <w:rFonts w:ascii="Arial" w:hAnsi="Arial" w:eastAsia="Arial"/>
+              <w:color w:val="5E5659"/>
+              <w:sz w:val="15"/>
+            </w:rPr>
+            <w:fldChar w:fldCharType="begin"/>
+            <w:instrText xml:space="preserve"> PAGE </w:instrText>
+            <w:fldChar w:fldCharType="separate"/>
+            <w:t>1</w:t>
+            <w:fldChar w:fldCharType="end"/>
+          </w:r>
+        </w:p>
+      </w:tc>
+    </w:tr>
+  </w:tbl>
   <w:p>
     <w:pPr>
       <w:pStyle w:val="Footer"/>
-      <w:jc w:val="center"/>
-    </w:pPr>
-    <w:r>
-      <w:rPr>
-        <w:rFonts w:ascii="Inter" w:hAnsi="Inter" w:eastAsia="Inter"/>
-        <w:b w:val="0"/>
-        <w:color w:val="6E5960"/>
-        <w:sz w:val="13"/>
-      </w:rPr>
-      <w:t>Hashem Kayyali | Resume</w:t>
-    </w:r>
+      <w:spacing w:before="0" w:after="0" w:line="20" w:lineRule="exact"/>
+    </w:pPr>
   </w:p>
 </w:ftr>
 </file>
@@ -1171,9 +1924,14 @@
     <w:name w:val="Normal"/>
     <w:qFormat/>
     <w:rsid w:val="00FC693F"/>
+    <w:pPr>
+      <w:widowControl/>
+      <w:spacing w:before="0" w:after="60" w:line="254" w:lineRule="auto"/>
+    </w:pPr>
     <w:rPr>
-      <w:rFonts w:ascii="Inter" w:hAnsi="Inter" w:eastAsia="Inter"/>
-      <w:sz w:val="16"/>
+      <w:rFonts w:ascii="Arial" w:hAnsi="Arial"/>
+      <w:color w:val="1D1B1C"/>
+      <w:sz w:val="18"/>
     </w:rPr>
   </w:style>
   <w:style w:type="paragraph" w:styleId="Header">
@@ -1231,15 +1989,16 @@
     <w:pPr>
       <w:keepNext/>
       <w:keepLines/>
+      <w:widowControl/>
       <w:spacing w:before="480" w:after="0"/>
       <w:outlineLvl w:val="0"/>
     </w:pPr>
     <w:rPr>
-      <w:rFonts w:asciiTheme="majorHAnsi" w:eastAsiaTheme="majorEastAsia" w:hAnsiTheme="majorHAnsi" w:cstheme="majorBidi"/>
+      <w:rFonts w:asciiTheme="majorHAnsi" w:eastAsiaTheme="majorEastAsia" w:hAnsiTheme="majorHAnsi" w:cstheme="majorBidi" w:ascii="Arial" w:hAnsi="Arial"/>
       <w:b/>
       <w:bCs/>
-      <w:color w:val="365F91" w:themeColor="accent1" w:themeShade="BF"/>
-      <w:sz w:val="28"/>
+      <w:color w:val="65172D"/>
+      <w:sz w:val="23"/>
       <w:szCs w:val="28"/>
     </w:rPr>
   </w:style>
@@ -1255,15 +2014,16 @@
     <w:pPr>
       <w:keepNext/>
       <w:keepLines/>
+      <w:widowControl/>
       <w:spacing w:before="200" w:after="0"/>
       <w:outlineLvl w:val="1"/>
     </w:pPr>
     <w:rPr>
-      <w:rFonts w:asciiTheme="majorHAnsi" w:eastAsiaTheme="majorEastAsia" w:hAnsiTheme="majorHAnsi" w:cstheme="majorBidi"/>
+      <w:rFonts w:asciiTheme="majorHAnsi" w:eastAsiaTheme="majorEastAsia" w:hAnsiTheme="majorHAnsi" w:cstheme="majorBidi" w:ascii="Arial" w:hAnsi="Arial"/>
       <w:b/>
       <w:bCs/>
-      <w:color w:val="4F81BD" w:themeColor="accent1"/>
-      <w:sz w:val="26"/>
+      <w:color w:val="330813"/>
+      <w:sz w:val="21"/>
       <w:szCs w:val="26"/>
     </w:rPr>
   </w:style>
@@ -1279,14 +2039,16 @@
     <w:pPr>
       <w:keepNext/>
       <w:keepLines/>
+      <w:widowControl/>
       <w:spacing w:before="200" w:after="0"/>
       <w:outlineLvl w:val="2"/>
     </w:pPr>
     <w:rPr>
-      <w:rFonts w:asciiTheme="majorHAnsi" w:eastAsiaTheme="majorEastAsia" w:hAnsiTheme="majorHAnsi" w:cstheme="majorBidi"/>
+      <w:rFonts w:asciiTheme="majorHAnsi" w:eastAsiaTheme="majorEastAsia" w:hAnsiTheme="majorHAnsi" w:cstheme="majorBidi" w:ascii="Arial" w:hAnsi="Arial"/>
       <w:b/>
       <w:bCs/>
-      <w:color w:val="4F81BD" w:themeColor="accent1"/>
+      <w:color w:val="1D1B1C"/>
+      <w:sz w:val="19"/>
     </w:rPr>
   </w:style>
   <w:style w:type="paragraph" w:styleId="Heading4">
@@ -1699,11 +2461,19 @@
     <w:unhideWhenUsed/>
     <w:rsid w:val="00326F90"/>
     <w:pPr>
+      <w:widowControl/>
       <w:numPr>
         <w:numId w:val="1"/>
       </w:numPr>
+      <w:spacing w:before="0" w:after="42" w:line="250" w:lineRule="auto"/>
+      <w:ind w:left="232" w:hanging="125" w:right="0"/>
       <w:contextualSpacing/>
     </w:pPr>
+    <w:rPr>
+      <w:rFonts w:ascii="Arial" w:hAnsi="Arial"/>
+      <w:color w:val="1D1B1C"/>
+      <w:sz w:val="18"/>
+    </w:rPr>
   </w:style>
   <w:style w:type="paragraph" w:styleId="ListBullet2">
     <w:name w:val="List Bullet 2"/>
@@ -12858,14 +13628,69 @@
       </w:tcPr>
     </w:tblStylePr>
   </w:style>
-  <w:style w:type="paragraph" w:customStyle="1" w:styleId="CompactBullet">
-    <w:name w:val="Compact Bullet"/>
-    <w:pPr>
-      <w:spacing w:after="10" w:line="252" w:lineRule="auto"/>
-      <w:ind w:left="230" w:hanging="144"/>
+  <w:style w:type="paragraph" w:customStyle="1" w:styleId="ResumeContact">
+    <w:name w:val="Resume Contact"/>
+    <w:pPr>
+      <w:spacing w:before="0" w:after="30" w:line="240" w:lineRule="auto"/>
     </w:pPr>
     <w:rPr>
-      <w:rFonts w:ascii="Inter" w:hAnsi="Inter" w:eastAsia="Inter"/>
+      <w:rFonts w:ascii="Arial" w:hAnsi="Arial"/>
+      <w:color w:val="5E5659"/>
+      <w:sz w:val="17"/>
+    </w:rPr>
+  </w:style>
+  <w:style w:type="paragraph" w:customStyle="1" w:styleId="ResumeSummary">
+    <w:name w:val="Resume Summary"/>
+    <w:pPr>
+      <w:spacing w:before="0" w:after="100" w:line="264" w:lineRule="auto"/>
+    </w:pPr>
+    <w:rPr>
+      <w:rFonts w:ascii="Arial" w:hAnsi="Arial"/>
+      <w:color w:val="1D1B1C"/>
+      <w:sz w:val="18"/>
+    </w:rPr>
+  </w:style>
+  <w:style w:type="paragraph" w:customStyle="1" w:styleId="ResumeMeta">
+    <w:name w:val="Resume Meta"/>
+    <w:pPr>
+      <w:spacing w:before="0" w:after="60" w:line="240" w:lineRule="auto"/>
+    </w:pPr>
+    <w:rPr>
+      <w:rFonts w:ascii="Arial" w:hAnsi="Arial"/>
+      <w:color w:val="5E5659"/>
+      <w:sz w:val="17"/>
+    </w:rPr>
+  </w:style>
+  <w:style w:type="paragraph" w:customStyle="1" w:styleId="ResumeSkill">
+    <w:name w:val="Resume Skill"/>
+    <w:pPr>
+      <w:spacing w:before="0" w:after="48" w:line="245" w:lineRule="auto"/>
+    </w:pPr>
+    <w:rPr>
+      <w:rFonts w:ascii="Arial" w:hAnsi="Arial"/>
+      <w:color w:val="1D1B1C"/>
+      <w:sz w:val="18"/>
+    </w:rPr>
+  </w:style>
+  <w:style w:type="paragraph" w:customStyle="1" w:styleId="ResumeProjectTech">
+    <w:name w:val="Resume Project Tech"/>
+    <w:pPr>
+      <w:spacing w:before="0" w:after="100" w:line="240" w:lineRule="auto"/>
+    </w:pPr>
+    <w:rPr>
+      <w:rFonts w:ascii="Arial" w:hAnsi="Arial"/>
+      <w:color w:val="5E5659"/>
+      <w:sz w:val="17"/>
+    </w:rPr>
+  </w:style>
+  <w:style w:type="paragraph" w:customStyle="1" w:styleId="ResumeFooter">
+    <w:name w:val="Resume Footer"/>
+    <w:pPr>
+      <w:spacing w:before="40" w:after="0" w:line="240" w:lineRule="auto"/>
+    </w:pPr>
+    <w:rPr>
+      <w:rFonts w:ascii="Arial" w:hAnsi="Arial"/>
+      <w:color w:val="5E5659"/>
       <w:sz w:val="15"/>
     </w:rPr>
   </w:style>

</xml_diff>